<commit_message>
Sync Workbook answer blocks to the three dimensions used by the guides
The Workbook answer fields were labeled in plain language (The
requirement / Product / platform / How it helps and the outcome) while
the Solution Guide and Grading Guide use the dimension names. Relabeled
each Workbook answer field to lead with its dimension and points,
Problem Identifier / 5, Solution Designer / 10, Value Communicator / 10,
with the plain prompt underneath, and restructured the Workbook worked
example the same way. The Workbook, Solution Guide and Grading Guide now
present the same three dimensions in the same order, so a proctor grades
the Workbook field by field.

Co-Authored-By: Claude Opus 4.8 <noreply@anthropic.com>
Claude-Session: https://claude.ai/code/session_01QFagQxWq3DUNgqxaEaNjHo
</commit_message>
<xml_diff>
--- a/case-study-pack/docx/HMF-Workbook.docx
+++ b/case-study-pack/docx/HMF-Workbook.docx
@@ -1384,11 +1384,110 @@
                 <w:b/>
                 <w:bCs/>
                 <w:caps/>
-                <w:color w:val="036C8F"/>
+                <w:color w:val="4A3AA8"/>
                 <w:sz w:val="16"/>
                 <w:szCs w:val="16"/>
               </w:rPr>
-              <w:t xml:space="preserve">Product / Platform</w:t>
+              <w:t xml:space="preserve">Problem Identifier</w:t>
+            </w:r>
+            <w:r>
+              <w:rPr>
+                <w:rFonts w:ascii="Calibri" w:cs="Calibri" w:eastAsia="Calibri" w:hAnsi="Calibri"/>
+                <w:color w:val="7E8CA1"/>
+                <w:sz w:val="14"/>
+                <w:szCs w:val="14"/>
+              </w:rPr>
+              <w:t xml:space="preserve">  ·  the requirement</w:t>
+            </w:r>
+          </w:p>
+          <w:tbl>
+            <w:tblPr>
+              <w:tblW w:type="dxa" w:w="9360"/>
+              <w:tblBorders>
+                <w:top w:val="single" w:color="auto" w:sz="4"/>
+                <w:left w:val="single" w:color="auto" w:sz="4"/>
+                <w:bottom w:val="single" w:color="auto" w:sz="4"/>
+                <w:right w:val="single" w:color="auto" w:sz="4"/>
+                <w:insideH w:val="single" w:color="auto" w:sz="4"/>
+                <w:insideV w:val="single" w:color="auto" w:sz="4"/>
+              </w:tblBorders>
+            </w:tblPr>
+            <w:tblGrid>
+              <w:gridCol w:w="9360"/>
+            </w:tblGrid>
+            <w:tr>
+              <w:tc>
+                <w:tcPr>
+                  <w:tcW w:type="dxa" w:w="9360"/>
+                  <w:tcBorders>
+                    <w:top w:val="single" w:color="E1E8F1" w:sz="6"/>
+                    <w:left w:val="single" w:color="E1E8F1" w:sz="6"/>
+                    <w:bottom w:val="single" w:color="E1E8F1" w:sz="6"/>
+                    <w:right w:val="single" w:color="E1E8F1" w:sz="6"/>
+                  </w:tcBorders>
+                  <w:tcMar>
+                    <w:top w:type="dxa" w:w="110"/>
+                    <w:left w:type="dxa" w:w="160"/>
+                    <w:bottom w:type="dxa" w:w="110"/>
+                    <w:right w:type="dxa" w:w="160"/>
+                  </w:tcMar>
+                  <w:vAlign w:val="top"/>
+                </w:tcPr>
+                <w:p>
+                  <w:pPr>
+                    <w:spacing w:after="0" w:before="0" w:line="276"/>
+                  </w:pPr>
+                  <w:r>
+                    <w:rPr>
+                      <w:rFonts w:ascii="Calibri" w:cs="Calibri" w:eastAsia="Calibri" w:hAnsi="Calibri"/>
+                      <w:color w:val="2A3C52"/>
+                      <w:sz w:val="20"/>
+                      <w:szCs w:val="20"/>
+                    </w:rPr>
+                    <w:t xml:space="preserve">The real requirement is preventing sensitive patient data from leaving the organisation through an unsanctioned AI app, with visibility and control over how it is used.</w:t>
+                  </w:r>
+                </w:p>
+              </w:tc>
+            </w:tr>
+          </w:tbl>
+          <w:p>
+            <w:pPr>
+              <w:spacing w:after="60"/>
+            </w:pPr>
+            <w:r>
+              <w:rPr>
+                <w:rFonts w:ascii="Calibri" w:cs="Calibri" w:eastAsia="Calibri" w:hAnsi="Calibri"/>
+                <w:color w:val="14263A"/>
+                <w:sz w:val="2"/>
+                <w:szCs w:val="2"/>
+              </w:rPr>
+              <w:t xml:space="preserve"/>
+            </w:r>
+          </w:p>
+          <w:p>
+            <w:pPr>
+              <w:spacing w:after="50" w:before="110" w:line="276"/>
+            </w:pPr>
+            <w:r>
+              <w:rPr>
+                <w:rFonts w:ascii="Calibri" w:cs="Calibri" w:eastAsia="Calibri" w:hAnsi="Calibri"/>
+                <w:b/>
+                <w:bCs/>
+                <w:caps/>
+                <w:color w:val="0B6670"/>
+                <w:sz w:val="16"/>
+                <w:szCs w:val="16"/>
+              </w:rPr>
+              <w:t xml:space="preserve">Solution Designer</w:t>
+            </w:r>
+            <w:r>
+              <w:rPr>
+                <w:rFonts w:ascii="Calibri" w:cs="Calibri" w:eastAsia="Calibri" w:hAnsi="Calibri"/>
+                <w:color w:val="7E8CA1"/>
+                <w:sz w:val="14"/>
+                <w:szCs w:val="14"/>
+              </w:rPr>
+              <w:t xml:space="preserve">  ·  product / platform</w:t>
             </w:r>
           </w:p>
           <w:tbl>
@@ -1467,11 +1566,20 @@
                 <w:b/>
                 <w:bCs/>
                 <w:caps/>
-                <w:color w:val="036C8F"/>
+                <w:color w:val="9A6516"/>
                 <w:sz w:val="16"/>
                 <w:szCs w:val="16"/>
               </w:rPr>
-              <w:t xml:space="preserve">Solution Engineer response</w:t>
+              <w:t xml:space="preserve">Value Communicator</w:t>
+            </w:r>
+            <w:r>
+              <w:rPr>
+                <w:rFonts w:ascii="Calibri" w:cs="Calibri" w:eastAsia="Calibri" w:hAnsi="Calibri"/>
+                <w:color w:val="7E8CA1"/>
+                <w:sz w:val="14"/>
+                <w:szCs w:val="14"/>
+              </w:rPr>
+              <w:t xml:space="preserve">  ·  how it helps and the outcome</w:t>
             </w:r>
           </w:p>
           <w:tbl>
@@ -1516,31 +1624,11 @@
                       <w:rFonts w:ascii="Calibri" w:cs="Calibri" w:eastAsia="Calibri" w:hAnsi="Calibri"/>
                       <w:b/>
                       <w:bCs/>
-                      <w:color w:val="4A3AA8"/>
+                      <w:color w:val="0D274D"/>
                       <w:sz w:val="20"/>
                       <w:szCs w:val="20"/>
                     </w:rPr>
-                    <w:t xml:space="preserve">Identify. </w:t>
-                  </w:r>
-                  <w:r>
-                    <w:rPr>
-                      <w:rFonts w:ascii="Calibri" w:cs="Calibri" w:eastAsia="Calibri" w:hAnsi="Calibri"/>
-                      <w:color w:val="2A3C52"/>
-                      <w:sz w:val="20"/>
-                      <w:szCs w:val="20"/>
-                    </w:rPr>
-                    <w:t xml:space="preserve">The real requirement is preventing sensitive patient data from leaving the organisation through an unsanctioned AI app, with visibility and control over how it is used. </w:t>
-                  </w:r>
-                  <w:r>
-                    <w:rPr>
-                      <w:rFonts w:ascii="Calibri" w:cs="Calibri" w:eastAsia="Calibri" w:hAnsi="Calibri"/>
-                      <w:b/>
-                      <w:bCs/>
-                      <w:color w:val="0B6670"/>
-                      <w:sz w:val="20"/>
-                      <w:szCs w:val="20"/>
-                    </w:rPr>
-                    <w:t xml:space="preserve">Design. </w:t>
+                    <w:t xml:space="preserve">How it works. </w:t>
                   </w:r>
                   <w:r>
                     <w:rPr>
@@ -1556,11 +1644,11 @@
                       <w:rFonts w:ascii="Calibri" w:cs="Calibri" w:eastAsia="Calibri" w:hAnsi="Calibri"/>
                       <w:b/>
                       <w:bCs/>
-                      <w:color w:val="9A6516"/>
+                      <w:color w:val="0D274D"/>
                       <w:sz w:val="20"/>
                       <w:szCs w:val="20"/>
                     </w:rPr>
-                    <w:t xml:space="preserve">Communicate. </w:t>
+                    <w:t xml:space="preserve">Outcome. </w:t>
                   </w:r>
                   <w:r>
                     <w:rPr>
@@ -3868,16 +3956,16 @@
         </w:tblBorders>
       </w:tblPr>
       <w:tblGrid>
-        <w:gridCol w:w="2000"/>
-        <w:gridCol w:w="7360"/>
+        <w:gridCol w:w="2600"/>
+        <w:gridCol w:w="6760"/>
       </w:tblGrid>
       <w:tr>
         <w:trPr>
-          <w:trHeight w:val="369" w:hRule="atLeast"/>
+          <w:trHeight w:val="397" w:hRule="atLeast"/>
         </w:trPr>
         <w:tc>
           <w:tcPr>
-            <w:tcW w:type="dxa" w:w="2000"/>
+            <w:tcW w:type="dxa" w:w="2600"/>
             <w:tcBorders>
               <w:top w:val="none" w:color="FFFFFF" w:sz="0"/>
               <w:left w:val="none" w:color="FFFFFF" w:sz="0"/>
@@ -3888,13 +3976,13 @@
               <w:top w:type="dxa" w:w="90"/>
               <w:left w:type="dxa" w:w="150"/>
               <w:bottom w:type="dxa" w:w="90"/>
-              <w:right w:type="dxa" w:w="100"/>
+              <w:right w:type="dxa" w:w="110"/>
             </w:tcMar>
             <w:vAlign w:val="top"/>
           </w:tcPr>
           <w:p>
             <w:pPr>
-              <w:spacing w:after="0" w:before="0" w:line="276"/>
+              <w:spacing w:after="10" w:before="0" w:line="276"/>
             </w:pPr>
             <w:r>
               <w:rPr>
@@ -3906,13 +3994,38 @@
                 <w:sz w:val="15"/>
                 <w:szCs w:val="15"/>
               </w:rPr>
-              <w:t xml:space="preserve">The requirement</w:t>
-            </w:r>
-          </w:p>
-        </w:tc>
-        <w:tc>
-          <w:tcPr>
-            <w:tcW w:type="dxa" w:w="7360"/>
+              <w:t xml:space="preserve">Problem Identifier</w:t>
+            </w:r>
+            <w:r>
+              <w:rPr>
+                <w:rFonts w:ascii="Calibri" w:cs="Calibri" w:eastAsia="Calibri" w:hAnsi="Calibri"/>
+                <w:b/>
+                <w:bCs/>
+                <w:color w:val="7E8CA1"/>
+                <w:sz w:val="13"/>
+                <w:szCs w:val="13"/>
+              </w:rPr>
+              <w:t xml:space="preserve">  / 5</w:t>
+            </w:r>
+          </w:p>
+          <w:p>
+            <w:pPr>
+              <w:spacing w:after="0" w:before="0" w:line="276"/>
+            </w:pPr>
+            <w:r>
+              <w:rPr>
+                <w:rFonts w:ascii="Calibri" w:cs="Calibri" w:eastAsia="Calibri" w:hAnsi="Calibri"/>
+                <w:color w:val="7E8CA1"/>
+                <w:sz w:val="14"/>
+                <w:szCs w:val="14"/>
+              </w:rPr>
+              <w:t xml:space="preserve">The requirement behind the concern</w:t>
+            </w:r>
+          </w:p>
+        </w:tc>
+        <w:tc>
+          <w:tcPr>
+            <w:tcW w:type="dxa" w:w="6760"/>
             <w:tcBorders>
               <w:top w:val="none" w:color="FFFFFF" w:sz="0"/>
               <w:left w:val="none" w:color="FFFFFF" w:sz="0"/>
@@ -3944,11 +4057,11 @@
       </w:tr>
       <w:tr>
         <w:trPr>
-          <w:trHeight w:val="369" w:hRule="atLeast"/>
+          <w:trHeight w:val="397" w:hRule="atLeast"/>
         </w:trPr>
         <w:tc>
           <w:tcPr>
-            <w:tcW w:type="dxa" w:w="2000"/>
+            <w:tcW w:type="dxa" w:w="2600"/>
             <w:tcBorders>
               <w:top w:val="none" w:color="FFFFFF" w:sz="0"/>
               <w:left w:val="none" w:color="FFFFFF" w:sz="0"/>
@@ -3959,13 +4072,13 @@
               <w:top w:type="dxa" w:w="90"/>
               <w:left w:type="dxa" w:w="150"/>
               <w:bottom w:type="dxa" w:w="90"/>
-              <w:right w:type="dxa" w:w="100"/>
+              <w:right w:type="dxa" w:w="110"/>
             </w:tcMar>
             <w:vAlign w:val="top"/>
           </w:tcPr>
           <w:p>
             <w:pPr>
-              <w:spacing w:after="0" w:before="0" w:line="276"/>
+              <w:spacing w:after="10" w:before="0" w:line="276"/>
             </w:pPr>
             <w:r>
               <w:rPr>
@@ -3977,13 +4090,38 @@
                 <w:sz w:val="15"/>
                 <w:szCs w:val="15"/>
               </w:rPr>
+              <w:t xml:space="preserve">Solution Designer</w:t>
+            </w:r>
+            <w:r>
+              <w:rPr>
+                <w:rFonts w:ascii="Calibri" w:cs="Calibri" w:eastAsia="Calibri" w:hAnsi="Calibri"/>
+                <w:b/>
+                <w:bCs/>
+                <w:color w:val="7E8CA1"/>
+                <w:sz w:val="13"/>
+                <w:szCs w:val="13"/>
+              </w:rPr>
+              <w:t xml:space="preserve">  / 10</w:t>
+            </w:r>
+          </w:p>
+          <w:p>
+            <w:pPr>
+              <w:spacing w:after="0" w:before="0" w:line="276"/>
+            </w:pPr>
+            <w:r>
+              <w:rPr>
+                <w:rFonts w:ascii="Calibri" w:cs="Calibri" w:eastAsia="Calibri" w:hAnsi="Calibri"/>
+                <w:color w:val="7E8CA1"/>
+                <w:sz w:val="14"/>
+                <w:szCs w:val="14"/>
+              </w:rPr>
               <w:t xml:space="preserve">Product / platform</w:t>
             </w:r>
           </w:p>
         </w:tc>
         <w:tc>
           <w:tcPr>
-            <w:tcW w:type="dxa" w:w="7360"/>
+            <w:tcW w:type="dxa" w:w="6760"/>
             <w:tcBorders>
               <w:top w:val="none" w:color="FFFFFF" w:sz="0"/>
               <w:left w:val="none" w:color="FFFFFF" w:sz="0"/>
@@ -4019,7 +4157,7 @@
         </w:trPr>
         <w:tc>
           <w:tcPr>
-            <w:tcW w:type="dxa" w:w="2000"/>
+            <w:tcW w:type="dxa" w:w="2600"/>
             <w:tcBorders>
               <w:top w:val="none" w:color="FFFFFF" w:sz="0"/>
               <w:left w:val="none" w:color="FFFFFF" w:sz="0"/>
@@ -4030,13 +4168,13 @@
               <w:top w:type="dxa" w:w="90"/>
               <w:left w:type="dxa" w:w="150"/>
               <w:bottom w:type="dxa" w:w="90"/>
-              <w:right w:type="dxa" w:w="100"/>
+              <w:right w:type="dxa" w:w="110"/>
             </w:tcMar>
             <w:vAlign w:val="top"/>
           </w:tcPr>
           <w:p>
             <w:pPr>
-              <w:spacing w:after="0" w:before="0" w:line="276"/>
+              <w:spacing w:after="10" w:before="0" w:line="276"/>
             </w:pPr>
             <w:r>
               <w:rPr>
@@ -4048,13 +4186,38 @@
                 <w:sz w:val="15"/>
                 <w:szCs w:val="15"/>
               </w:rPr>
+              <w:t xml:space="preserve">Value Communicator</w:t>
+            </w:r>
+            <w:r>
+              <w:rPr>
+                <w:rFonts w:ascii="Calibri" w:cs="Calibri" w:eastAsia="Calibri" w:hAnsi="Calibri"/>
+                <w:b/>
+                <w:bCs/>
+                <w:color w:val="7E8CA1"/>
+                <w:sz w:val="13"/>
+                <w:szCs w:val="13"/>
+              </w:rPr>
+              <w:t xml:space="preserve">  / 10</w:t>
+            </w:r>
+          </w:p>
+          <w:p>
+            <w:pPr>
+              <w:spacing w:after="0" w:before="0" w:line="276"/>
+            </w:pPr>
+            <w:r>
+              <w:rPr>
+                <w:rFonts w:ascii="Calibri" w:cs="Calibri" w:eastAsia="Calibri" w:hAnsi="Calibri"/>
+                <w:color w:val="7E8CA1"/>
+                <w:sz w:val="14"/>
+                <w:szCs w:val="14"/>
+              </w:rPr>
               <w:t xml:space="preserve">How it helps, and the outcome</w:t>
             </w:r>
           </w:p>
         </w:tc>
         <w:tc>
           <w:tcPr>
-            <w:tcW w:type="dxa" w:w="7360"/>
+            <w:tcW w:type="dxa" w:w="6760"/>
             <w:tcBorders>
               <w:top w:val="none" w:color="FFFFFF" w:sz="0"/>
               <w:left w:val="none" w:color="FFFFFF" w:sz="0"/>
@@ -4190,16 +4353,16 @@
         </w:tblBorders>
       </w:tblPr>
       <w:tblGrid>
-        <w:gridCol w:w="2000"/>
-        <w:gridCol w:w="7360"/>
+        <w:gridCol w:w="2600"/>
+        <w:gridCol w:w="6760"/>
       </w:tblGrid>
       <w:tr>
         <w:trPr>
-          <w:trHeight w:val="369" w:hRule="atLeast"/>
+          <w:trHeight w:val="397" w:hRule="atLeast"/>
         </w:trPr>
         <w:tc>
           <w:tcPr>
-            <w:tcW w:type="dxa" w:w="2000"/>
+            <w:tcW w:type="dxa" w:w="2600"/>
             <w:tcBorders>
               <w:top w:val="none" w:color="FFFFFF" w:sz="0"/>
               <w:left w:val="none" w:color="FFFFFF" w:sz="0"/>
@@ -4210,13 +4373,13 @@
               <w:top w:type="dxa" w:w="90"/>
               <w:left w:type="dxa" w:w="150"/>
               <w:bottom w:type="dxa" w:w="90"/>
-              <w:right w:type="dxa" w:w="100"/>
+              <w:right w:type="dxa" w:w="110"/>
             </w:tcMar>
             <w:vAlign w:val="top"/>
           </w:tcPr>
           <w:p>
             <w:pPr>
-              <w:spacing w:after="0" w:before="0" w:line="276"/>
+              <w:spacing w:after="10" w:before="0" w:line="276"/>
             </w:pPr>
             <w:r>
               <w:rPr>
@@ -4228,13 +4391,38 @@
                 <w:sz w:val="15"/>
                 <w:szCs w:val="15"/>
               </w:rPr>
-              <w:t xml:space="preserve">The requirement</w:t>
-            </w:r>
-          </w:p>
-        </w:tc>
-        <w:tc>
-          <w:tcPr>
-            <w:tcW w:type="dxa" w:w="7360"/>
+              <w:t xml:space="preserve">Problem Identifier</w:t>
+            </w:r>
+            <w:r>
+              <w:rPr>
+                <w:rFonts w:ascii="Calibri" w:cs="Calibri" w:eastAsia="Calibri" w:hAnsi="Calibri"/>
+                <w:b/>
+                <w:bCs/>
+                <w:color w:val="7E8CA1"/>
+                <w:sz w:val="13"/>
+                <w:szCs w:val="13"/>
+              </w:rPr>
+              <w:t xml:space="preserve">  / 5</w:t>
+            </w:r>
+          </w:p>
+          <w:p>
+            <w:pPr>
+              <w:spacing w:after="0" w:before="0" w:line="276"/>
+            </w:pPr>
+            <w:r>
+              <w:rPr>
+                <w:rFonts w:ascii="Calibri" w:cs="Calibri" w:eastAsia="Calibri" w:hAnsi="Calibri"/>
+                <w:color w:val="7E8CA1"/>
+                <w:sz w:val="14"/>
+                <w:szCs w:val="14"/>
+              </w:rPr>
+              <w:t xml:space="preserve">The requirement behind the concern</w:t>
+            </w:r>
+          </w:p>
+        </w:tc>
+        <w:tc>
+          <w:tcPr>
+            <w:tcW w:type="dxa" w:w="6760"/>
             <w:tcBorders>
               <w:top w:val="none" w:color="FFFFFF" w:sz="0"/>
               <w:left w:val="none" w:color="FFFFFF" w:sz="0"/>
@@ -4266,11 +4454,11 @@
       </w:tr>
       <w:tr>
         <w:trPr>
-          <w:trHeight w:val="369" w:hRule="atLeast"/>
+          <w:trHeight w:val="397" w:hRule="atLeast"/>
         </w:trPr>
         <w:tc>
           <w:tcPr>
-            <w:tcW w:type="dxa" w:w="2000"/>
+            <w:tcW w:type="dxa" w:w="2600"/>
             <w:tcBorders>
               <w:top w:val="none" w:color="FFFFFF" w:sz="0"/>
               <w:left w:val="none" w:color="FFFFFF" w:sz="0"/>
@@ -4281,13 +4469,13 @@
               <w:top w:type="dxa" w:w="90"/>
               <w:left w:type="dxa" w:w="150"/>
               <w:bottom w:type="dxa" w:w="90"/>
-              <w:right w:type="dxa" w:w="100"/>
+              <w:right w:type="dxa" w:w="110"/>
             </w:tcMar>
             <w:vAlign w:val="top"/>
           </w:tcPr>
           <w:p>
             <w:pPr>
-              <w:spacing w:after="0" w:before="0" w:line="276"/>
+              <w:spacing w:after="10" w:before="0" w:line="276"/>
             </w:pPr>
             <w:r>
               <w:rPr>
@@ -4299,13 +4487,38 @@
                 <w:sz w:val="15"/>
                 <w:szCs w:val="15"/>
               </w:rPr>
+              <w:t xml:space="preserve">Solution Designer</w:t>
+            </w:r>
+            <w:r>
+              <w:rPr>
+                <w:rFonts w:ascii="Calibri" w:cs="Calibri" w:eastAsia="Calibri" w:hAnsi="Calibri"/>
+                <w:b/>
+                <w:bCs/>
+                <w:color w:val="7E8CA1"/>
+                <w:sz w:val="13"/>
+                <w:szCs w:val="13"/>
+              </w:rPr>
+              <w:t xml:space="preserve">  / 10</w:t>
+            </w:r>
+          </w:p>
+          <w:p>
+            <w:pPr>
+              <w:spacing w:after="0" w:before="0" w:line="276"/>
+            </w:pPr>
+            <w:r>
+              <w:rPr>
+                <w:rFonts w:ascii="Calibri" w:cs="Calibri" w:eastAsia="Calibri" w:hAnsi="Calibri"/>
+                <w:color w:val="7E8CA1"/>
+                <w:sz w:val="14"/>
+                <w:szCs w:val="14"/>
+              </w:rPr>
               <w:t xml:space="preserve">Product / platform</w:t>
             </w:r>
           </w:p>
         </w:tc>
         <w:tc>
           <w:tcPr>
-            <w:tcW w:type="dxa" w:w="7360"/>
+            <w:tcW w:type="dxa" w:w="6760"/>
             <w:tcBorders>
               <w:top w:val="none" w:color="FFFFFF" w:sz="0"/>
               <w:left w:val="none" w:color="FFFFFF" w:sz="0"/>
@@ -4341,7 +4554,7 @@
         </w:trPr>
         <w:tc>
           <w:tcPr>
-            <w:tcW w:type="dxa" w:w="2000"/>
+            <w:tcW w:type="dxa" w:w="2600"/>
             <w:tcBorders>
               <w:top w:val="none" w:color="FFFFFF" w:sz="0"/>
               <w:left w:val="none" w:color="FFFFFF" w:sz="0"/>
@@ -4352,13 +4565,13 @@
               <w:top w:type="dxa" w:w="90"/>
               <w:left w:type="dxa" w:w="150"/>
               <w:bottom w:type="dxa" w:w="90"/>
-              <w:right w:type="dxa" w:w="100"/>
+              <w:right w:type="dxa" w:w="110"/>
             </w:tcMar>
             <w:vAlign w:val="top"/>
           </w:tcPr>
           <w:p>
             <w:pPr>
-              <w:spacing w:after="0" w:before="0" w:line="276"/>
+              <w:spacing w:after="10" w:before="0" w:line="276"/>
             </w:pPr>
             <w:r>
               <w:rPr>
@@ -4370,13 +4583,38 @@
                 <w:sz w:val="15"/>
                 <w:szCs w:val="15"/>
               </w:rPr>
+              <w:t xml:space="preserve">Value Communicator</w:t>
+            </w:r>
+            <w:r>
+              <w:rPr>
+                <w:rFonts w:ascii="Calibri" w:cs="Calibri" w:eastAsia="Calibri" w:hAnsi="Calibri"/>
+                <w:b/>
+                <w:bCs/>
+                <w:color w:val="7E8CA1"/>
+                <w:sz w:val="13"/>
+                <w:szCs w:val="13"/>
+              </w:rPr>
+              <w:t xml:space="preserve">  / 10</w:t>
+            </w:r>
+          </w:p>
+          <w:p>
+            <w:pPr>
+              <w:spacing w:after="0" w:before="0" w:line="276"/>
+            </w:pPr>
+            <w:r>
+              <w:rPr>
+                <w:rFonts w:ascii="Calibri" w:cs="Calibri" w:eastAsia="Calibri" w:hAnsi="Calibri"/>
+                <w:color w:val="7E8CA1"/>
+                <w:sz w:val="14"/>
+                <w:szCs w:val="14"/>
+              </w:rPr>
               <w:t xml:space="preserve">How it helps, and the outcome</w:t>
             </w:r>
           </w:p>
         </w:tc>
         <w:tc>
           <w:tcPr>
-            <w:tcW w:type="dxa" w:w="7360"/>
+            <w:tcW w:type="dxa" w:w="6760"/>
             <w:tcBorders>
               <w:top w:val="none" w:color="FFFFFF" w:sz="0"/>
               <w:left w:val="none" w:color="FFFFFF" w:sz="0"/>
@@ -4512,16 +4750,16 @@
         </w:tblBorders>
       </w:tblPr>
       <w:tblGrid>
-        <w:gridCol w:w="2000"/>
-        <w:gridCol w:w="7360"/>
+        <w:gridCol w:w="2600"/>
+        <w:gridCol w:w="6760"/>
       </w:tblGrid>
       <w:tr>
         <w:trPr>
-          <w:trHeight w:val="369" w:hRule="atLeast"/>
+          <w:trHeight w:val="397" w:hRule="atLeast"/>
         </w:trPr>
         <w:tc>
           <w:tcPr>
-            <w:tcW w:type="dxa" w:w="2000"/>
+            <w:tcW w:type="dxa" w:w="2600"/>
             <w:tcBorders>
               <w:top w:val="none" w:color="FFFFFF" w:sz="0"/>
               <w:left w:val="none" w:color="FFFFFF" w:sz="0"/>
@@ -4532,13 +4770,13 @@
               <w:top w:type="dxa" w:w="90"/>
               <w:left w:type="dxa" w:w="150"/>
               <w:bottom w:type="dxa" w:w="90"/>
-              <w:right w:type="dxa" w:w="100"/>
+              <w:right w:type="dxa" w:w="110"/>
             </w:tcMar>
             <w:vAlign w:val="top"/>
           </w:tcPr>
           <w:p>
             <w:pPr>
-              <w:spacing w:after="0" w:before="0" w:line="276"/>
+              <w:spacing w:after="10" w:before="0" w:line="276"/>
             </w:pPr>
             <w:r>
               <w:rPr>
@@ -4550,13 +4788,38 @@
                 <w:sz w:val="15"/>
                 <w:szCs w:val="15"/>
               </w:rPr>
-              <w:t xml:space="preserve">The requirement</w:t>
-            </w:r>
-          </w:p>
-        </w:tc>
-        <w:tc>
-          <w:tcPr>
-            <w:tcW w:type="dxa" w:w="7360"/>
+              <w:t xml:space="preserve">Problem Identifier</w:t>
+            </w:r>
+            <w:r>
+              <w:rPr>
+                <w:rFonts w:ascii="Calibri" w:cs="Calibri" w:eastAsia="Calibri" w:hAnsi="Calibri"/>
+                <w:b/>
+                <w:bCs/>
+                <w:color w:val="7E8CA1"/>
+                <w:sz w:val="13"/>
+                <w:szCs w:val="13"/>
+              </w:rPr>
+              <w:t xml:space="preserve">  / 5</w:t>
+            </w:r>
+          </w:p>
+          <w:p>
+            <w:pPr>
+              <w:spacing w:after="0" w:before="0" w:line="276"/>
+            </w:pPr>
+            <w:r>
+              <w:rPr>
+                <w:rFonts w:ascii="Calibri" w:cs="Calibri" w:eastAsia="Calibri" w:hAnsi="Calibri"/>
+                <w:color w:val="7E8CA1"/>
+                <w:sz w:val="14"/>
+                <w:szCs w:val="14"/>
+              </w:rPr>
+              <w:t xml:space="preserve">The requirement behind the concern</w:t>
+            </w:r>
+          </w:p>
+        </w:tc>
+        <w:tc>
+          <w:tcPr>
+            <w:tcW w:type="dxa" w:w="6760"/>
             <w:tcBorders>
               <w:top w:val="none" w:color="FFFFFF" w:sz="0"/>
               <w:left w:val="none" w:color="FFFFFF" w:sz="0"/>
@@ -4588,11 +4851,11 @@
       </w:tr>
       <w:tr>
         <w:trPr>
-          <w:trHeight w:val="369" w:hRule="atLeast"/>
+          <w:trHeight w:val="397" w:hRule="atLeast"/>
         </w:trPr>
         <w:tc>
           <w:tcPr>
-            <w:tcW w:type="dxa" w:w="2000"/>
+            <w:tcW w:type="dxa" w:w="2600"/>
             <w:tcBorders>
               <w:top w:val="none" w:color="FFFFFF" w:sz="0"/>
               <w:left w:val="none" w:color="FFFFFF" w:sz="0"/>
@@ -4603,13 +4866,13 @@
               <w:top w:type="dxa" w:w="90"/>
               <w:left w:type="dxa" w:w="150"/>
               <w:bottom w:type="dxa" w:w="90"/>
-              <w:right w:type="dxa" w:w="100"/>
+              <w:right w:type="dxa" w:w="110"/>
             </w:tcMar>
             <w:vAlign w:val="top"/>
           </w:tcPr>
           <w:p>
             <w:pPr>
-              <w:spacing w:after="0" w:before="0" w:line="276"/>
+              <w:spacing w:after="10" w:before="0" w:line="276"/>
             </w:pPr>
             <w:r>
               <w:rPr>
@@ -4621,13 +4884,38 @@
                 <w:sz w:val="15"/>
                 <w:szCs w:val="15"/>
               </w:rPr>
+              <w:t xml:space="preserve">Solution Designer</w:t>
+            </w:r>
+            <w:r>
+              <w:rPr>
+                <w:rFonts w:ascii="Calibri" w:cs="Calibri" w:eastAsia="Calibri" w:hAnsi="Calibri"/>
+                <w:b/>
+                <w:bCs/>
+                <w:color w:val="7E8CA1"/>
+                <w:sz w:val="13"/>
+                <w:szCs w:val="13"/>
+              </w:rPr>
+              <w:t xml:space="preserve">  / 10</w:t>
+            </w:r>
+          </w:p>
+          <w:p>
+            <w:pPr>
+              <w:spacing w:after="0" w:before="0" w:line="276"/>
+            </w:pPr>
+            <w:r>
+              <w:rPr>
+                <w:rFonts w:ascii="Calibri" w:cs="Calibri" w:eastAsia="Calibri" w:hAnsi="Calibri"/>
+                <w:color w:val="7E8CA1"/>
+                <w:sz w:val="14"/>
+                <w:szCs w:val="14"/>
+              </w:rPr>
               <w:t xml:space="preserve">Product / platform</w:t>
             </w:r>
           </w:p>
         </w:tc>
         <w:tc>
           <w:tcPr>
-            <w:tcW w:type="dxa" w:w="7360"/>
+            <w:tcW w:type="dxa" w:w="6760"/>
             <w:tcBorders>
               <w:top w:val="none" w:color="FFFFFF" w:sz="0"/>
               <w:left w:val="none" w:color="FFFFFF" w:sz="0"/>
@@ -4663,7 +4951,7 @@
         </w:trPr>
         <w:tc>
           <w:tcPr>
-            <w:tcW w:type="dxa" w:w="2000"/>
+            <w:tcW w:type="dxa" w:w="2600"/>
             <w:tcBorders>
               <w:top w:val="none" w:color="FFFFFF" w:sz="0"/>
               <w:left w:val="none" w:color="FFFFFF" w:sz="0"/>
@@ -4674,13 +4962,13 @@
               <w:top w:type="dxa" w:w="90"/>
               <w:left w:type="dxa" w:w="150"/>
               <w:bottom w:type="dxa" w:w="90"/>
-              <w:right w:type="dxa" w:w="100"/>
+              <w:right w:type="dxa" w:w="110"/>
             </w:tcMar>
             <w:vAlign w:val="top"/>
           </w:tcPr>
           <w:p>
             <w:pPr>
-              <w:spacing w:after="0" w:before="0" w:line="276"/>
+              <w:spacing w:after="10" w:before="0" w:line="276"/>
             </w:pPr>
             <w:r>
               <w:rPr>
@@ -4692,13 +4980,38 @@
                 <w:sz w:val="15"/>
                 <w:szCs w:val="15"/>
               </w:rPr>
+              <w:t xml:space="preserve">Value Communicator</w:t>
+            </w:r>
+            <w:r>
+              <w:rPr>
+                <w:rFonts w:ascii="Calibri" w:cs="Calibri" w:eastAsia="Calibri" w:hAnsi="Calibri"/>
+                <w:b/>
+                <w:bCs/>
+                <w:color w:val="7E8CA1"/>
+                <w:sz w:val="13"/>
+                <w:szCs w:val="13"/>
+              </w:rPr>
+              <w:t xml:space="preserve">  / 10</w:t>
+            </w:r>
+          </w:p>
+          <w:p>
+            <w:pPr>
+              <w:spacing w:after="0" w:before="0" w:line="276"/>
+            </w:pPr>
+            <w:r>
+              <w:rPr>
+                <w:rFonts w:ascii="Calibri" w:cs="Calibri" w:eastAsia="Calibri" w:hAnsi="Calibri"/>
+                <w:color w:val="7E8CA1"/>
+                <w:sz w:val="14"/>
+                <w:szCs w:val="14"/>
+              </w:rPr>
               <w:t xml:space="preserve">How it helps, and the outcome</w:t>
             </w:r>
           </w:p>
         </w:tc>
         <w:tc>
           <w:tcPr>
-            <w:tcW w:type="dxa" w:w="7360"/>
+            <w:tcW w:type="dxa" w:w="6760"/>
             <w:tcBorders>
               <w:top w:val="none" w:color="FFFFFF" w:sz="0"/>
               <w:left w:val="none" w:color="FFFFFF" w:sz="0"/>
@@ -4834,16 +5147,16 @@
         </w:tblBorders>
       </w:tblPr>
       <w:tblGrid>
-        <w:gridCol w:w="2000"/>
-        <w:gridCol w:w="7360"/>
+        <w:gridCol w:w="2600"/>
+        <w:gridCol w:w="6760"/>
       </w:tblGrid>
       <w:tr>
         <w:trPr>
-          <w:trHeight w:val="369" w:hRule="atLeast"/>
+          <w:trHeight w:val="397" w:hRule="atLeast"/>
         </w:trPr>
         <w:tc>
           <w:tcPr>
-            <w:tcW w:type="dxa" w:w="2000"/>
+            <w:tcW w:type="dxa" w:w="2600"/>
             <w:tcBorders>
               <w:top w:val="none" w:color="FFFFFF" w:sz="0"/>
               <w:left w:val="none" w:color="FFFFFF" w:sz="0"/>
@@ -4854,13 +5167,13 @@
               <w:top w:type="dxa" w:w="90"/>
               <w:left w:type="dxa" w:w="150"/>
               <w:bottom w:type="dxa" w:w="90"/>
-              <w:right w:type="dxa" w:w="100"/>
+              <w:right w:type="dxa" w:w="110"/>
             </w:tcMar>
             <w:vAlign w:val="top"/>
           </w:tcPr>
           <w:p>
             <w:pPr>
-              <w:spacing w:after="0" w:before="0" w:line="276"/>
+              <w:spacing w:after="10" w:before="0" w:line="276"/>
             </w:pPr>
             <w:r>
               <w:rPr>
@@ -4872,13 +5185,38 @@
                 <w:sz w:val="15"/>
                 <w:szCs w:val="15"/>
               </w:rPr>
-              <w:t xml:space="preserve">The requirement</w:t>
-            </w:r>
-          </w:p>
-        </w:tc>
-        <w:tc>
-          <w:tcPr>
-            <w:tcW w:type="dxa" w:w="7360"/>
+              <w:t xml:space="preserve">Problem Identifier</w:t>
+            </w:r>
+            <w:r>
+              <w:rPr>
+                <w:rFonts w:ascii="Calibri" w:cs="Calibri" w:eastAsia="Calibri" w:hAnsi="Calibri"/>
+                <w:b/>
+                <w:bCs/>
+                <w:color w:val="7E8CA1"/>
+                <w:sz w:val="13"/>
+                <w:szCs w:val="13"/>
+              </w:rPr>
+              <w:t xml:space="preserve">  / 5</w:t>
+            </w:r>
+          </w:p>
+          <w:p>
+            <w:pPr>
+              <w:spacing w:after="0" w:before="0" w:line="276"/>
+            </w:pPr>
+            <w:r>
+              <w:rPr>
+                <w:rFonts w:ascii="Calibri" w:cs="Calibri" w:eastAsia="Calibri" w:hAnsi="Calibri"/>
+                <w:color w:val="7E8CA1"/>
+                <w:sz w:val="14"/>
+                <w:szCs w:val="14"/>
+              </w:rPr>
+              <w:t xml:space="preserve">The requirement behind the concern</w:t>
+            </w:r>
+          </w:p>
+        </w:tc>
+        <w:tc>
+          <w:tcPr>
+            <w:tcW w:type="dxa" w:w="6760"/>
             <w:tcBorders>
               <w:top w:val="none" w:color="FFFFFF" w:sz="0"/>
               <w:left w:val="none" w:color="FFFFFF" w:sz="0"/>
@@ -4910,11 +5248,11 @@
       </w:tr>
       <w:tr>
         <w:trPr>
-          <w:trHeight w:val="369" w:hRule="atLeast"/>
+          <w:trHeight w:val="397" w:hRule="atLeast"/>
         </w:trPr>
         <w:tc>
           <w:tcPr>
-            <w:tcW w:type="dxa" w:w="2000"/>
+            <w:tcW w:type="dxa" w:w="2600"/>
             <w:tcBorders>
               <w:top w:val="none" w:color="FFFFFF" w:sz="0"/>
               <w:left w:val="none" w:color="FFFFFF" w:sz="0"/>
@@ -4925,13 +5263,13 @@
               <w:top w:type="dxa" w:w="90"/>
               <w:left w:type="dxa" w:w="150"/>
               <w:bottom w:type="dxa" w:w="90"/>
-              <w:right w:type="dxa" w:w="100"/>
+              <w:right w:type="dxa" w:w="110"/>
             </w:tcMar>
             <w:vAlign w:val="top"/>
           </w:tcPr>
           <w:p>
             <w:pPr>
-              <w:spacing w:after="0" w:before="0" w:line="276"/>
+              <w:spacing w:after="10" w:before="0" w:line="276"/>
             </w:pPr>
             <w:r>
               <w:rPr>
@@ -4943,13 +5281,38 @@
                 <w:sz w:val="15"/>
                 <w:szCs w:val="15"/>
               </w:rPr>
+              <w:t xml:space="preserve">Solution Designer</w:t>
+            </w:r>
+            <w:r>
+              <w:rPr>
+                <w:rFonts w:ascii="Calibri" w:cs="Calibri" w:eastAsia="Calibri" w:hAnsi="Calibri"/>
+                <w:b/>
+                <w:bCs/>
+                <w:color w:val="7E8CA1"/>
+                <w:sz w:val="13"/>
+                <w:szCs w:val="13"/>
+              </w:rPr>
+              <w:t xml:space="preserve">  / 10</w:t>
+            </w:r>
+          </w:p>
+          <w:p>
+            <w:pPr>
+              <w:spacing w:after="0" w:before="0" w:line="276"/>
+            </w:pPr>
+            <w:r>
+              <w:rPr>
+                <w:rFonts w:ascii="Calibri" w:cs="Calibri" w:eastAsia="Calibri" w:hAnsi="Calibri"/>
+                <w:color w:val="7E8CA1"/>
+                <w:sz w:val="14"/>
+                <w:szCs w:val="14"/>
+              </w:rPr>
               <w:t xml:space="preserve">Product / platform</w:t>
             </w:r>
           </w:p>
         </w:tc>
         <w:tc>
           <w:tcPr>
-            <w:tcW w:type="dxa" w:w="7360"/>
+            <w:tcW w:type="dxa" w:w="6760"/>
             <w:tcBorders>
               <w:top w:val="none" w:color="FFFFFF" w:sz="0"/>
               <w:left w:val="none" w:color="FFFFFF" w:sz="0"/>
@@ -4985,7 +5348,7 @@
         </w:trPr>
         <w:tc>
           <w:tcPr>
-            <w:tcW w:type="dxa" w:w="2000"/>
+            <w:tcW w:type="dxa" w:w="2600"/>
             <w:tcBorders>
               <w:top w:val="none" w:color="FFFFFF" w:sz="0"/>
               <w:left w:val="none" w:color="FFFFFF" w:sz="0"/>
@@ -4996,13 +5359,13 @@
               <w:top w:type="dxa" w:w="90"/>
               <w:left w:type="dxa" w:w="150"/>
               <w:bottom w:type="dxa" w:w="90"/>
-              <w:right w:type="dxa" w:w="100"/>
+              <w:right w:type="dxa" w:w="110"/>
             </w:tcMar>
             <w:vAlign w:val="top"/>
           </w:tcPr>
           <w:p>
             <w:pPr>
-              <w:spacing w:after="0" w:before="0" w:line="276"/>
+              <w:spacing w:after="10" w:before="0" w:line="276"/>
             </w:pPr>
             <w:r>
               <w:rPr>
@@ -5014,13 +5377,38 @@
                 <w:sz w:val="15"/>
                 <w:szCs w:val="15"/>
               </w:rPr>
+              <w:t xml:space="preserve">Value Communicator</w:t>
+            </w:r>
+            <w:r>
+              <w:rPr>
+                <w:rFonts w:ascii="Calibri" w:cs="Calibri" w:eastAsia="Calibri" w:hAnsi="Calibri"/>
+                <w:b/>
+                <w:bCs/>
+                <w:color w:val="7E8CA1"/>
+                <w:sz w:val="13"/>
+                <w:szCs w:val="13"/>
+              </w:rPr>
+              <w:t xml:space="preserve">  / 10</w:t>
+            </w:r>
+          </w:p>
+          <w:p>
+            <w:pPr>
+              <w:spacing w:after="0" w:before="0" w:line="276"/>
+            </w:pPr>
+            <w:r>
+              <w:rPr>
+                <w:rFonts w:ascii="Calibri" w:cs="Calibri" w:eastAsia="Calibri" w:hAnsi="Calibri"/>
+                <w:color w:val="7E8CA1"/>
+                <w:sz w:val="14"/>
+                <w:szCs w:val="14"/>
+              </w:rPr>
               <w:t xml:space="preserve">How it helps, and the outcome</w:t>
             </w:r>
           </w:p>
         </w:tc>
         <w:tc>
           <w:tcPr>
-            <w:tcW w:type="dxa" w:w="7360"/>
+            <w:tcW w:type="dxa" w:w="6760"/>
             <w:tcBorders>
               <w:top w:val="none" w:color="FFFFFF" w:sz="0"/>
               <w:left w:val="none" w:color="FFFFFF" w:sz="0"/>
@@ -5417,16 +5805,16 @@
         </w:tblBorders>
       </w:tblPr>
       <w:tblGrid>
-        <w:gridCol w:w="2000"/>
-        <w:gridCol w:w="7360"/>
+        <w:gridCol w:w="2600"/>
+        <w:gridCol w:w="6760"/>
       </w:tblGrid>
       <w:tr>
         <w:trPr>
-          <w:trHeight w:val="369" w:hRule="atLeast"/>
+          <w:trHeight w:val="397" w:hRule="atLeast"/>
         </w:trPr>
         <w:tc>
           <w:tcPr>
-            <w:tcW w:type="dxa" w:w="2000"/>
+            <w:tcW w:type="dxa" w:w="2600"/>
             <w:tcBorders>
               <w:top w:val="none" w:color="FFFFFF" w:sz="0"/>
               <w:left w:val="none" w:color="FFFFFF" w:sz="0"/>
@@ -5437,13 +5825,13 @@
               <w:top w:type="dxa" w:w="90"/>
               <w:left w:type="dxa" w:w="150"/>
               <w:bottom w:type="dxa" w:w="90"/>
-              <w:right w:type="dxa" w:w="100"/>
+              <w:right w:type="dxa" w:w="110"/>
             </w:tcMar>
             <w:vAlign w:val="top"/>
           </w:tcPr>
           <w:p>
             <w:pPr>
-              <w:spacing w:after="0" w:before="0" w:line="276"/>
+              <w:spacing w:after="10" w:before="0" w:line="276"/>
             </w:pPr>
             <w:r>
               <w:rPr>
@@ -5455,13 +5843,38 @@
                 <w:sz w:val="15"/>
                 <w:szCs w:val="15"/>
               </w:rPr>
-              <w:t xml:space="preserve">The requirement</w:t>
-            </w:r>
-          </w:p>
-        </w:tc>
-        <w:tc>
-          <w:tcPr>
-            <w:tcW w:type="dxa" w:w="7360"/>
+              <w:t xml:space="preserve">Problem Identifier</w:t>
+            </w:r>
+            <w:r>
+              <w:rPr>
+                <w:rFonts w:ascii="Calibri" w:cs="Calibri" w:eastAsia="Calibri" w:hAnsi="Calibri"/>
+                <w:b/>
+                <w:bCs/>
+                <w:color w:val="7E8CA1"/>
+                <w:sz w:val="13"/>
+                <w:szCs w:val="13"/>
+              </w:rPr>
+              <w:t xml:space="preserve">  / 5</w:t>
+            </w:r>
+          </w:p>
+          <w:p>
+            <w:pPr>
+              <w:spacing w:after="0" w:before="0" w:line="276"/>
+            </w:pPr>
+            <w:r>
+              <w:rPr>
+                <w:rFonts w:ascii="Calibri" w:cs="Calibri" w:eastAsia="Calibri" w:hAnsi="Calibri"/>
+                <w:color w:val="7E8CA1"/>
+                <w:sz w:val="14"/>
+                <w:szCs w:val="14"/>
+              </w:rPr>
+              <w:t xml:space="preserve">The requirement behind the concern</w:t>
+            </w:r>
+          </w:p>
+        </w:tc>
+        <w:tc>
+          <w:tcPr>
+            <w:tcW w:type="dxa" w:w="6760"/>
             <w:tcBorders>
               <w:top w:val="none" w:color="FFFFFF" w:sz="0"/>
               <w:left w:val="none" w:color="FFFFFF" w:sz="0"/>
@@ -5493,11 +5906,11 @@
       </w:tr>
       <w:tr>
         <w:trPr>
-          <w:trHeight w:val="369" w:hRule="atLeast"/>
+          <w:trHeight w:val="397" w:hRule="atLeast"/>
         </w:trPr>
         <w:tc>
           <w:tcPr>
-            <w:tcW w:type="dxa" w:w="2000"/>
+            <w:tcW w:type="dxa" w:w="2600"/>
             <w:tcBorders>
               <w:top w:val="none" w:color="FFFFFF" w:sz="0"/>
               <w:left w:val="none" w:color="FFFFFF" w:sz="0"/>
@@ -5508,13 +5921,13 @@
               <w:top w:type="dxa" w:w="90"/>
               <w:left w:type="dxa" w:w="150"/>
               <w:bottom w:type="dxa" w:w="90"/>
-              <w:right w:type="dxa" w:w="100"/>
+              <w:right w:type="dxa" w:w="110"/>
             </w:tcMar>
             <w:vAlign w:val="top"/>
           </w:tcPr>
           <w:p>
             <w:pPr>
-              <w:spacing w:after="0" w:before="0" w:line="276"/>
+              <w:spacing w:after="10" w:before="0" w:line="276"/>
             </w:pPr>
             <w:r>
               <w:rPr>
@@ -5526,13 +5939,38 @@
                 <w:sz w:val="15"/>
                 <w:szCs w:val="15"/>
               </w:rPr>
+              <w:t xml:space="preserve">Solution Designer</w:t>
+            </w:r>
+            <w:r>
+              <w:rPr>
+                <w:rFonts w:ascii="Calibri" w:cs="Calibri" w:eastAsia="Calibri" w:hAnsi="Calibri"/>
+                <w:b/>
+                <w:bCs/>
+                <w:color w:val="7E8CA1"/>
+                <w:sz w:val="13"/>
+                <w:szCs w:val="13"/>
+              </w:rPr>
+              <w:t xml:space="preserve">  / 10</w:t>
+            </w:r>
+          </w:p>
+          <w:p>
+            <w:pPr>
+              <w:spacing w:after="0" w:before="0" w:line="276"/>
+            </w:pPr>
+            <w:r>
+              <w:rPr>
+                <w:rFonts w:ascii="Calibri" w:cs="Calibri" w:eastAsia="Calibri" w:hAnsi="Calibri"/>
+                <w:color w:val="7E8CA1"/>
+                <w:sz w:val="14"/>
+                <w:szCs w:val="14"/>
+              </w:rPr>
               <w:t xml:space="preserve">Product / platform</w:t>
             </w:r>
           </w:p>
         </w:tc>
         <w:tc>
           <w:tcPr>
-            <w:tcW w:type="dxa" w:w="7360"/>
+            <w:tcW w:type="dxa" w:w="6760"/>
             <w:tcBorders>
               <w:top w:val="none" w:color="FFFFFF" w:sz="0"/>
               <w:left w:val="none" w:color="FFFFFF" w:sz="0"/>
@@ -5568,7 +6006,7 @@
         </w:trPr>
         <w:tc>
           <w:tcPr>
-            <w:tcW w:type="dxa" w:w="2000"/>
+            <w:tcW w:type="dxa" w:w="2600"/>
             <w:tcBorders>
               <w:top w:val="none" w:color="FFFFFF" w:sz="0"/>
               <w:left w:val="none" w:color="FFFFFF" w:sz="0"/>
@@ -5579,13 +6017,13 @@
               <w:top w:type="dxa" w:w="90"/>
               <w:left w:type="dxa" w:w="150"/>
               <w:bottom w:type="dxa" w:w="90"/>
-              <w:right w:type="dxa" w:w="100"/>
+              <w:right w:type="dxa" w:w="110"/>
             </w:tcMar>
             <w:vAlign w:val="top"/>
           </w:tcPr>
           <w:p>
             <w:pPr>
-              <w:spacing w:after="0" w:before="0" w:line="276"/>
+              <w:spacing w:after="10" w:before="0" w:line="276"/>
             </w:pPr>
             <w:r>
               <w:rPr>
@@ -5597,13 +6035,38 @@
                 <w:sz w:val="15"/>
                 <w:szCs w:val="15"/>
               </w:rPr>
+              <w:t xml:space="preserve">Value Communicator</w:t>
+            </w:r>
+            <w:r>
+              <w:rPr>
+                <w:rFonts w:ascii="Calibri" w:cs="Calibri" w:eastAsia="Calibri" w:hAnsi="Calibri"/>
+                <w:b/>
+                <w:bCs/>
+                <w:color w:val="7E8CA1"/>
+                <w:sz w:val="13"/>
+                <w:szCs w:val="13"/>
+              </w:rPr>
+              <w:t xml:space="preserve">  / 10</w:t>
+            </w:r>
+          </w:p>
+          <w:p>
+            <w:pPr>
+              <w:spacing w:after="0" w:before="0" w:line="276"/>
+            </w:pPr>
+            <w:r>
+              <w:rPr>
+                <w:rFonts w:ascii="Calibri" w:cs="Calibri" w:eastAsia="Calibri" w:hAnsi="Calibri"/>
+                <w:color w:val="7E8CA1"/>
+                <w:sz w:val="14"/>
+                <w:szCs w:val="14"/>
+              </w:rPr>
               <w:t xml:space="preserve">How it helps, and the outcome</w:t>
             </w:r>
           </w:p>
         </w:tc>
         <w:tc>
           <w:tcPr>
-            <w:tcW w:type="dxa" w:w="7360"/>
+            <w:tcW w:type="dxa" w:w="6760"/>
             <w:tcBorders>
               <w:top w:val="none" w:color="FFFFFF" w:sz="0"/>
               <w:left w:val="none" w:color="FFFFFF" w:sz="0"/>
@@ -5739,16 +6202,16 @@
         </w:tblBorders>
       </w:tblPr>
       <w:tblGrid>
-        <w:gridCol w:w="2000"/>
-        <w:gridCol w:w="7360"/>
+        <w:gridCol w:w="2600"/>
+        <w:gridCol w:w="6760"/>
       </w:tblGrid>
       <w:tr>
         <w:trPr>
-          <w:trHeight w:val="369" w:hRule="atLeast"/>
+          <w:trHeight w:val="397" w:hRule="atLeast"/>
         </w:trPr>
         <w:tc>
           <w:tcPr>
-            <w:tcW w:type="dxa" w:w="2000"/>
+            <w:tcW w:type="dxa" w:w="2600"/>
             <w:tcBorders>
               <w:top w:val="none" w:color="FFFFFF" w:sz="0"/>
               <w:left w:val="none" w:color="FFFFFF" w:sz="0"/>
@@ -5759,13 +6222,13 @@
               <w:top w:type="dxa" w:w="90"/>
               <w:left w:type="dxa" w:w="150"/>
               <w:bottom w:type="dxa" w:w="90"/>
-              <w:right w:type="dxa" w:w="100"/>
+              <w:right w:type="dxa" w:w="110"/>
             </w:tcMar>
             <w:vAlign w:val="top"/>
           </w:tcPr>
           <w:p>
             <w:pPr>
-              <w:spacing w:after="0" w:before="0" w:line="276"/>
+              <w:spacing w:after="10" w:before="0" w:line="276"/>
             </w:pPr>
             <w:r>
               <w:rPr>
@@ -5777,13 +6240,38 @@
                 <w:sz w:val="15"/>
                 <w:szCs w:val="15"/>
               </w:rPr>
-              <w:t xml:space="preserve">The requirement</w:t>
-            </w:r>
-          </w:p>
-        </w:tc>
-        <w:tc>
-          <w:tcPr>
-            <w:tcW w:type="dxa" w:w="7360"/>
+              <w:t xml:space="preserve">Problem Identifier</w:t>
+            </w:r>
+            <w:r>
+              <w:rPr>
+                <w:rFonts w:ascii="Calibri" w:cs="Calibri" w:eastAsia="Calibri" w:hAnsi="Calibri"/>
+                <w:b/>
+                <w:bCs/>
+                <w:color w:val="7E8CA1"/>
+                <w:sz w:val="13"/>
+                <w:szCs w:val="13"/>
+              </w:rPr>
+              <w:t xml:space="preserve">  / 5</w:t>
+            </w:r>
+          </w:p>
+          <w:p>
+            <w:pPr>
+              <w:spacing w:after="0" w:before="0" w:line="276"/>
+            </w:pPr>
+            <w:r>
+              <w:rPr>
+                <w:rFonts w:ascii="Calibri" w:cs="Calibri" w:eastAsia="Calibri" w:hAnsi="Calibri"/>
+                <w:color w:val="7E8CA1"/>
+                <w:sz w:val="14"/>
+                <w:szCs w:val="14"/>
+              </w:rPr>
+              <w:t xml:space="preserve">The requirement behind the concern</w:t>
+            </w:r>
+          </w:p>
+        </w:tc>
+        <w:tc>
+          <w:tcPr>
+            <w:tcW w:type="dxa" w:w="6760"/>
             <w:tcBorders>
               <w:top w:val="none" w:color="FFFFFF" w:sz="0"/>
               <w:left w:val="none" w:color="FFFFFF" w:sz="0"/>
@@ -5815,11 +6303,11 @@
       </w:tr>
       <w:tr>
         <w:trPr>
-          <w:trHeight w:val="369" w:hRule="atLeast"/>
+          <w:trHeight w:val="397" w:hRule="atLeast"/>
         </w:trPr>
         <w:tc>
           <w:tcPr>
-            <w:tcW w:type="dxa" w:w="2000"/>
+            <w:tcW w:type="dxa" w:w="2600"/>
             <w:tcBorders>
               <w:top w:val="none" w:color="FFFFFF" w:sz="0"/>
               <w:left w:val="none" w:color="FFFFFF" w:sz="0"/>
@@ -5830,13 +6318,13 @@
               <w:top w:type="dxa" w:w="90"/>
               <w:left w:type="dxa" w:w="150"/>
               <w:bottom w:type="dxa" w:w="90"/>
-              <w:right w:type="dxa" w:w="100"/>
+              <w:right w:type="dxa" w:w="110"/>
             </w:tcMar>
             <w:vAlign w:val="top"/>
           </w:tcPr>
           <w:p>
             <w:pPr>
-              <w:spacing w:after="0" w:before="0" w:line="276"/>
+              <w:spacing w:after="10" w:before="0" w:line="276"/>
             </w:pPr>
             <w:r>
               <w:rPr>
@@ -5848,13 +6336,38 @@
                 <w:sz w:val="15"/>
                 <w:szCs w:val="15"/>
               </w:rPr>
+              <w:t xml:space="preserve">Solution Designer</w:t>
+            </w:r>
+            <w:r>
+              <w:rPr>
+                <w:rFonts w:ascii="Calibri" w:cs="Calibri" w:eastAsia="Calibri" w:hAnsi="Calibri"/>
+                <w:b/>
+                <w:bCs/>
+                <w:color w:val="7E8CA1"/>
+                <w:sz w:val="13"/>
+                <w:szCs w:val="13"/>
+              </w:rPr>
+              <w:t xml:space="preserve">  / 10</w:t>
+            </w:r>
+          </w:p>
+          <w:p>
+            <w:pPr>
+              <w:spacing w:after="0" w:before="0" w:line="276"/>
+            </w:pPr>
+            <w:r>
+              <w:rPr>
+                <w:rFonts w:ascii="Calibri" w:cs="Calibri" w:eastAsia="Calibri" w:hAnsi="Calibri"/>
+                <w:color w:val="7E8CA1"/>
+                <w:sz w:val="14"/>
+                <w:szCs w:val="14"/>
+              </w:rPr>
               <w:t xml:space="preserve">Product / platform</w:t>
             </w:r>
           </w:p>
         </w:tc>
         <w:tc>
           <w:tcPr>
-            <w:tcW w:type="dxa" w:w="7360"/>
+            <w:tcW w:type="dxa" w:w="6760"/>
             <w:tcBorders>
               <w:top w:val="none" w:color="FFFFFF" w:sz="0"/>
               <w:left w:val="none" w:color="FFFFFF" w:sz="0"/>
@@ -5890,7 +6403,7 @@
         </w:trPr>
         <w:tc>
           <w:tcPr>
-            <w:tcW w:type="dxa" w:w="2000"/>
+            <w:tcW w:type="dxa" w:w="2600"/>
             <w:tcBorders>
               <w:top w:val="none" w:color="FFFFFF" w:sz="0"/>
               <w:left w:val="none" w:color="FFFFFF" w:sz="0"/>
@@ -5901,13 +6414,13 @@
               <w:top w:type="dxa" w:w="90"/>
               <w:left w:type="dxa" w:w="150"/>
               <w:bottom w:type="dxa" w:w="90"/>
-              <w:right w:type="dxa" w:w="100"/>
+              <w:right w:type="dxa" w:w="110"/>
             </w:tcMar>
             <w:vAlign w:val="top"/>
           </w:tcPr>
           <w:p>
             <w:pPr>
-              <w:spacing w:after="0" w:before="0" w:line="276"/>
+              <w:spacing w:after="10" w:before="0" w:line="276"/>
             </w:pPr>
             <w:r>
               <w:rPr>
@@ -5919,13 +6432,38 @@
                 <w:sz w:val="15"/>
                 <w:szCs w:val="15"/>
               </w:rPr>
+              <w:t xml:space="preserve">Value Communicator</w:t>
+            </w:r>
+            <w:r>
+              <w:rPr>
+                <w:rFonts w:ascii="Calibri" w:cs="Calibri" w:eastAsia="Calibri" w:hAnsi="Calibri"/>
+                <w:b/>
+                <w:bCs/>
+                <w:color w:val="7E8CA1"/>
+                <w:sz w:val="13"/>
+                <w:szCs w:val="13"/>
+              </w:rPr>
+              <w:t xml:space="preserve">  / 10</w:t>
+            </w:r>
+          </w:p>
+          <w:p>
+            <w:pPr>
+              <w:spacing w:after="0" w:before="0" w:line="276"/>
+            </w:pPr>
+            <w:r>
+              <w:rPr>
+                <w:rFonts w:ascii="Calibri" w:cs="Calibri" w:eastAsia="Calibri" w:hAnsi="Calibri"/>
+                <w:color w:val="7E8CA1"/>
+                <w:sz w:val="14"/>
+                <w:szCs w:val="14"/>
+              </w:rPr>
               <w:t xml:space="preserve">How it helps, and the outcome</w:t>
             </w:r>
           </w:p>
         </w:tc>
         <w:tc>
           <w:tcPr>
-            <w:tcW w:type="dxa" w:w="7360"/>
+            <w:tcW w:type="dxa" w:w="6760"/>
             <w:tcBorders>
               <w:top w:val="none" w:color="FFFFFF" w:sz="0"/>
               <w:left w:val="none" w:color="FFFFFF" w:sz="0"/>
@@ -6061,16 +6599,16 @@
         </w:tblBorders>
       </w:tblPr>
       <w:tblGrid>
-        <w:gridCol w:w="2000"/>
-        <w:gridCol w:w="7360"/>
+        <w:gridCol w:w="2600"/>
+        <w:gridCol w:w="6760"/>
       </w:tblGrid>
       <w:tr>
         <w:trPr>
-          <w:trHeight w:val="369" w:hRule="atLeast"/>
+          <w:trHeight w:val="397" w:hRule="atLeast"/>
         </w:trPr>
         <w:tc>
           <w:tcPr>
-            <w:tcW w:type="dxa" w:w="2000"/>
+            <w:tcW w:type="dxa" w:w="2600"/>
             <w:tcBorders>
               <w:top w:val="none" w:color="FFFFFF" w:sz="0"/>
               <w:left w:val="none" w:color="FFFFFF" w:sz="0"/>
@@ -6081,13 +6619,13 @@
               <w:top w:type="dxa" w:w="90"/>
               <w:left w:type="dxa" w:w="150"/>
               <w:bottom w:type="dxa" w:w="90"/>
-              <w:right w:type="dxa" w:w="100"/>
+              <w:right w:type="dxa" w:w="110"/>
             </w:tcMar>
             <w:vAlign w:val="top"/>
           </w:tcPr>
           <w:p>
             <w:pPr>
-              <w:spacing w:after="0" w:before="0" w:line="276"/>
+              <w:spacing w:after="10" w:before="0" w:line="276"/>
             </w:pPr>
             <w:r>
               <w:rPr>
@@ -6099,13 +6637,38 @@
                 <w:sz w:val="15"/>
                 <w:szCs w:val="15"/>
               </w:rPr>
-              <w:t xml:space="preserve">The requirement</w:t>
-            </w:r>
-          </w:p>
-        </w:tc>
-        <w:tc>
-          <w:tcPr>
-            <w:tcW w:type="dxa" w:w="7360"/>
+              <w:t xml:space="preserve">Problem Identifier</w:t>
+            </w:r>
+            <w:r>
+              <w:rPr>
+                <w:rFonts w:ascii="Calibri" w:cs="Calibri" w:eastAsia="Calibri" w:hAnsi="Calibri"/>
+                <w:b/>
+                <w:bCs/>
+                <w:color w:val="7E8CA1"/>
+                <w:sz w:val="13"/>
+                <w:szCs w:val="13"/>
+              </w:rPr>
+              <w:t xml:space="preserve">  / 5</w:t>
+            </w:r>
+          </w:p>
+          <w:p>
+            <w:pPr>
+              <w:spacing w:after="0" w:before="0" w:line="276"/>
+            </w:pPr>
+            <w:r>
+              <w:rPr>
+                <w:rFonts w:ascii="Calibri" w:cs="Calibri" w:eastAsia="Calibri" w:hAnsi="Calibri"/>
+                <w:color w:val="7E8CA1"/>
+                <w:sz w:val="14"/>
+                <w:szCs w:val="14"/>
+              </w:rPr>
+              <w:t xml:space="preserve">The requirement behind the concern</w:t>
+            </w:r>
+          </w:p>
+        </w:tc>
+        <w:tc>
+          <w:tcPr>
+            <w:tcW w:type="dxa" w:w="6760"/>
             <w:tcBorders>
               <w:top w:val="none" w:color="FFFFFF" w:sz="0"/>
               <w:left w:val="none" w:color="FFFFFF" w:sz="0"/>
@@ -6137,11 +6700,11 @@
       </w:tr>
       <w:tr>
         <w:trPr>
-          <w:trHeight w:val="369" w:hRule="atLeast"/>
+          <w:trHeight w:val="397" w:hRule="atLeast"/>
         </w:trPr>
         <w:tc>
           <w:tcPr>
-            <w:tcW w:type="dxa" w:w="2000"/>
+            <w:tcW w:type="dxa" w:w="2600"/>
             <w:tcBorders>
               <w:top w:val="none" w:color="FFFFFF" w:sz="0"/>
               <w:left w:val="none" w:color="FFFFFF" w:sz="0"/>
@@ -6152,13 +6715,13 @@
               <w:top w:type="dxa" w:w="90"/>
               <w:left w:type="dxa" w:w="150"/>
               <w:bottom w:type="dxa" w:w="90"/>
-              <w:right w:type="dxa" w:w="100"/>
+              <w:right w:type="dxa" w:w="110"/>
             </w:tcMar>
             <w:vAlign w:val="top"/>
           </w:tcPr>
           <w:p>
             <w:pPr>
-              <w:spacing w:after="0" w:before="0" w:line="276"/>
+              <w:spacing w:after="10" w:before="0" w:line="276"/>
             </w:pPr>
             <w:r>
               <w:rPr>
@@ -6170,13 +6733,38 @@
                 <w:sz w:val="15"/>
                 <w:szCs w:val="15"/>
               </w:rPr>
+              <w:t xml:space="preserve">Solution Designer</w:t>
+            </w:r>
+            <w:r>
+              <w:rPr>
+                <w:rFonts w:ascii="Calibri" w:cs="Calibri" w:eastAsia="Calibri" w:hAnsi="Calibri"/>
+                <w:b/>
+                <w:bCs/>
+                <w:color w:val="7E8CA1"/>
+                <w:sz w:val="13"/>
+                <w:szCs w:val="13"/>
+              </w:rPr>
+              <w:t xml:space="preserve">  / 10</w:t>
+            </w:r>
+          </w:p>
+          <w:p>
+            <w:pPr>
+              <w:spacing w:after="0" w:before="0" w:line="276"/>
+            </w:pPr>
+            <w:r>
+              <w:rPr>
+                <w:rFonts w:ascii="Calibri" w:cs="Calibri" w:eastAsia="Calibri" w:hAnsi="Calibri"/>
+                <w:color w:val="7E8CA1"/>
+                <w:sz w:val="14"/>
+                <w:szCs w:val="14"/>
+              </w:rPr>
               <w:t xml:space="preserve">Product / platform</w:t>
             </w:r>
           </w:p>
         </w:tc>
         <w:tc>
           <w:tcPr>
-            <w:tcW w:type="dxa" w:w="7360"/>
+            <w:tcW w:type="dxa" w:w="6760"/>
             <w:tcBorders>
               <w:top w:val="none" w:color="FFFFFF" w:sz="0"/>
               <w:left w:val="none" w:color="FFFFFF" w:sz="0"/>
@@ -6212,7 +6800,7 @@
         </w:trPr>
         <w:tc>
           <w:tcPr>
-            <w:tcW w:type="dxa" w:w="2000"/>
+            <w:tcW w:type="dxa" w:w="2600"/>
             <w:tcBorders>
               <w:top w:val="none" w:color="FFFFFF" w:sz="0"/>
               <w:left w:val="none" w:color="FFFFFF" w:sz="0"/>
@@ -6223,13 +6811,13 @@
               <w:top w:type="dxa" w:w="90"/>
               <w:left w:type="dxa" w:w="150"/>
               <w:bottom w:type="dxa" w:w="90"/>
-              <w:right w:type="dxa" w:w="100"/>
+              <w:right w:type="dxa" w:w="110"/>
             </w:tcMar>
             <w:vAlign w:val="top"/>
           </w:tcPr>
           <w:p>
             <w:pPr>
-              <w:spacing w:after="0" w:before="0" w:line="276"/>
+              <w:spacing w:after="10" w:before="0" w:line="276"/>
             </w:pPr>
             <w:r>
               <w:rPr>
@@ -6241,13 +6829,38 @@
                 <w:sz w:val="15"/>
                 <w:szCs w:val="15"/>
               </w:rPr>
+              <w:t xml:space="preserve">Value Communicator</w:t>
+            </w:r>
+            <w:r>
+              <w:rPr>
+                <w:rFonts w:ascii="Calibri" w:cs="Calibri" w:eastAsia="Calibri" w:hAnsi="Calibri"/>
+                <w:b/>
+                <w:bCs/>
+                <w:color w:val="7E8CA1"/>
+                <w:sz w:val="13"/>
+                <w:szCs w:val="13"/>
+              </w:rPr>
+              <w:t xml:space="preserve">  / 10</w:t>
+            </w:r>
+          </w:p>
+          <w:p>
+            <w:pPr>
+              <w:spacing w:after="0" w:before="0" w:line="276"/>
+            </w:pPr>
+            <w:r>
+              <w:rPr>
+                <w:rFonts w:ascii="Calibri" w:cs="Calibri" w:eastAsia="Calibri" w:hAnsi="Calibri"/>
+                <w:color w:val="7E8CA1"/>
+                <w:sz w:val="14"/>
+                <w:szCs w:val="14"/>
+              </w:rPr>
               <w:t xml:space="preserve">How it helps, and the outcome</w:t>
             </w:r>
           </w:p>
         </w:tc>
         <w:tc>
           <w:tcPr>
-            <w:tcW w:type="dxa" w:w="7360"/>
+            <w:tcW w:type="dxa" w:w="6760"/>
             <w:tcBorders>
               <w:top w:val="none" w:color="FFFFFF" w:sz="0"/>
               <w:left w:val="none" w:color="FFFFFF" w:sz="0"/>
@@ -6383,16 +6996,16 @@
         </w:tblBorders>
       </w:tblPr>
       <w:tblGrid>
-        <w:gridCol w:w="2000"/>
-        <w:gridCol w:w="7360"/>
+        <w:gridCol w:w="2600"/>
+        <w:gridCol w:w="6760"/>
       </w:tblGrid>
       <w:tr>
         <w:trPr>
-          <w:trHeight w:val="369" w:hRule="atLeast"/>
+          <w:trHeight w:val="397" w:hRule="atLeast"/>
         </w:trPr>
         <w:tc>
           <w:tcPr>
-            <w:tcW w:type="dxa" w:w="2000"/>
+            <w:tcW w:type="dxa" w:w="2600"/>
             <w:tcBorders>
               <w:top w:val="none" w:color="FFFFFF" w:sz="0"/>
               <w:left w:val="none" w:color="FFFFFF" w:sz="0"/>
@@ -6403,13 +7016,13 @@
               <w:top w:type="dxa" w:w="90"/>
               <w:left w:type="dxa" w:w="150"/>
               <w:bottom w:type="dxa" w:w="90"/>
-              <w:right w:type="dxa" w:w="100"/>
+              <w:right w:type="dxa" w:w="110"/>
             </w:tcMar>
             <w:vAlign w:val="top"/>
           </w:tcPr>
           <w:p>
             <w:pPr>
-              <w:spacing w:after="0" w:before="0" w:line="276"/>
+              <w:spacing w:after="10" w:before="0" w:line="276"/>
             </w:pPr>
             <w:r>
               <w:rPr>
@@ -6421,13 +7034,38 @@
                 <w:sz w:val="15"/>
                 <w:szCs w:val="15"/>
               </w:rPr>
-              <w:t xml:space="preserve">The requirement</w:t>
-            </w:r>
-          </w:p>
-        </w:tc>
-        <w:tc>
-          <w:tcPr>
-            <w:tcW w:type="dxa" w:w="7360"/>
+              <w:t xml:space="preserve">Problem Identifier</w:t>
+            </w:r>
+            <w:r>
+              <w:rPr>
+                <w:rFonts w:ascii="Calibri" w:cs="Calibri" w:eastAsia="Calibri" w:hAnsi="Calibri"/>
+                <w:b/>
+                <w:bCs/>
+                <w:color w:val="7E8CA1"/>
+                <w:sz w:val="13"/>
+                <w:szCs w:val="13"/>
+              </w:rPr>
+              <w:t xml:space="preserve">  / 5</w:t>
+            </w:r>
+          </w:p>
+          <w:p>
+            <w:pPr>
+              <w:spacing w:after="0" w:before="0" w:line="276"/>
+            </w:pPr>
+            <w:r>
+              <w:rPr>
+                <w:rFonts w:ascii="Calibri" w:cs="Calibri" w:eastAsia="Calibri" w:hAnsi="Calibri"/>
+                <w:color w:val="7E8CA1"/>
+                <w:sz w:val="14"/>
+                <w:szCs w:val="14"/>
+              </w:rPr>
+              <w:t xml:space="preserve">The requirement behind the concern</w:t>
+            </w:r>
+          </w:p>
+        </w:tc>
+        <w:tc>
+          <w:tcPr>
+            <w:tcW w:type="dxa" w:w="6760"/>
             <w:tcBorders>
               <w:top w:val="none" w:color="FFFFFF" w:sz="0"/>
               <w:left w:val="none" w:color="FFFFFF" w:sz="0"/>
@@ -6459,11 +7097,11 @@
       </w:tr>
       <w:tr>
         <w:trPr>
-          <w:trHeight w:val="369" w:hRule="atLeast"/>
+          <w:trHeight w:val="397" w:hRule="atLeast"/>
         </w:trPr>
         <w:tc>
           <w:tcPr>
-            <w:tcW w:type="dxa" w:w="2000"/>
+            <w:tcW w:type="dxa" w:w="2600"/>
             <w:tcBorders>
               <w:top w:val="none" w:color="FFFFFF" w:sz="0"/>
               <w:left w:val="none" w:color="FFFFFF" w:sz="0"/>
@@ -6474,13 +7112,13 @@
               <w:top w:type="dxa" w:w="90"/>
               <w:left w:type="dxa" w:w="150"/>
               <w:bottom w:type="dxa" w:w="90"/>
-              <w:right w:type="dxa" w:w="100"/>
+              <w:right w:type="dxa" w:w="110"/>
             </w:tcMar>
             <w:vAlign w:val="top"/>
           </w:tcPr>
           <w:p>
             <w:pPr>
-              <w:spacing w:after="0" w:before="0" w:line="276"/>
+              <w:spacing w:after="10" w:before="0" w:line="276"/>
             </w:pPr>
             <w:r>
               <w:rPr>
@@ -6492,13 +7130,38 @@
                 <w:sz w:val="15"/>
                 <w:szCs w:val="15"/>
               </w:rPr>
+              <w:t xml:space="preserve">Solution Designer</w:t>
+            </w:r>
+            <w:r>
+              <w:rPr>
+                <w:rFonts w:ascii="Calibri" w:cs="Calibri" w:eastAsia="Calibri" w:hAnsi="Calibri"/>
+                <w:b/>
+                <w:bCs/>
+                <w:color w:val="7E8CA1"/>
+                <w:sz w:val="13"/>
+                <w:szCs w:val="13"/>
+              </w:rPr>
+              <w:t xml:space="preserve">  / 10</w:t>
+            </w:r>
+          </w:p>
+          <w:p>
+            <w:pPr>
+              <w:spacing w:after="0" w:before="0" w:line="276"/>
+            </w:pPr>
+            <w:r>
+              <w:rPr>
+                <w:rFonts w:ascii="Calibri" w:cs="Calibri" w:eastAsia="Calibri" w:hAnsi="Calibri"/>
+                <w:color w:val="7E8CA1"/>
+                <w:sz w:val="14"/>
+                <w:szCs w:val="14"/>
+              </w:rPr>
               <w:t xml:space="preserve">Product / platform</w:t>
             </w:r>
           </w:p>
         </w:tc>
         <w:tc>
           <w:tcPr>
-            <w:tcW w:type="dxa" w:w="7360"/>
+            <w:tcW w:type="dxa" w:w="6760"/>
             <w:tcBorders>
               <w:top w:val="none" w:color="FFFFFF" w:sz="0"/>
               <w:left w:val="none" w:color="FFFFFF" w:sz="0"/>
@@ -6534,7 +7197,7 @@
         </w:trPr>
         <w:tc>
           <w:tcPr>
-            <w:tcW w:type="dxa" w:w="2000"/>
+            <w:tcW w:type="dxa" w:w="2600"/>
             <w:tcBorders>
               <w:top w:val="none" w:color="FFFFFF" w:sz="0"/>
               <w:left w:val="none" w:color="FFFFFF" w:sz="0"/>
@@ -6545,13 +7208,13 @@
               <w:top w:type="dxa" w:w="90"/>
               <w:left w:type="dxa" w:w="150"/>
               <w:bottom w:type="dxa" w:w="90"/>
-              <w:right w:type="dxa" w:w="100"/>
+              <w:right w:type="dxa" w:w="110"/>
             </w:tcMar>
             <w:vAlign w:val="top"/>
           </w:tcPr>
           <w:p>
             <w:pPr>
-              <w:spacing w:after="0" w:before="0" w:line="276"/>
+              <w:spacing w:after="10" w:before="0" w:line="276"/>
             </w:pPr>
             <w:r>
               <w:rPr>
@@ -6563,13 +7226,38 @@
                 <w:sz w:val="15"/>
                 <w:szCs w:val="15"/>
               </w:rPr>
+              <w:t xml:space="preserve">Value Communicator</w:t>
+            </w:r>
+            <w:r>
+              <w:rPr>
+                <w:rFonts w:ascii="Calibri" w:cs="Calibri" w:eastAsia="Calibri" w:hAnsi="Calibri"/>
+                <w:b/>
+                <w:bCs/>
+                <w:color w:val="7E8CA1"/>
+                <w:sz w:val="13"/>
+                <w:szCs w:val="13"/>
+              </w:rPr>
+              <w:t xml:space="preserve">  / 10</w:t>
+            </w:r>
+          </w:p>
+          <w:p>
+            <w:pPr>
+              <w:spacing w:after="0" w:before="0" w:line="276"/>
+            </w:pPr>
+            <w:r>
+              <w:rPr>
+                <w:rFonts w:ascii="Calibri" w:cs="Calibri" w:eastAsia="Calibri" w:hAnsi="Calibri"/>
+                <w:color w:val="7E8CA1"/>
+                <w:sz w:val="14"/>
+                <w:szCs w:val="14"/>
+              </w:rPr>
               <w:t xml:space="preserve">How it helps, and the outcome</w:t>
             </w:r>
           </w:p>
         </w:tc>
         <w:tc>
           <w:tcPr>
-            <w:tcW w:type="dxa" w:w="7360"/>
+            <w:tcW w:type="dxa" w:w="6760"/>
             <w:tcBorders>
               <w:top w:val="none" w:color="FFFFFF" w:sz="0"/>
               <w:left w:val="none" w:color="FFFFFF" w:sz="0"/>
@@ -6966,16 +7654,16 @@
         </w:tblBorders>
       </w:tblPr>
       <w:tblGrid>
-        <w:gridCol w:w="2000"/>
-        <w:gridCol w:w="7360"/>
+        <w:gridCol w:w="2600"/>
+        <w:gridCol w:w="6760"/>
       </w:tblGrid>
       <w:tr>
         <w:trPr>
-          <w:trHeight w:val="369" w:hRule="atLeast"/>
+          <w:trHeight w:val="397" w:hRule="atLeast"/>
         </w:trPr>
         <w:tc>
           <w:tcPr>
-            <w:tcW w:type="dxa" w:w="2000"/>
+            <w:tcW w:type="dxa" w:w="2600"/>
             <w:tcBorders>
               <w:top w:val="none" w:color="FFFFFF" w:sz="0"/>
               <w:left w:val="none" w:color="FFFFFF" w:sz="0"/>
@@ -6986,13 +7674,13 @@
               <w:top w:type="dxa" w:w="90"/>
               <w:left w:type="dxa" w:w="150"/>
               <w:bottom w:type="dxa" w:w="90"/>
-              <w:right w:type="dxa" w:w="100"/>
+              <w:right w:type="dxa" w:w="110"/>
             </w:tcMar>
             <w:vAlign w:val="top"/>
           </w:tcPr>
           <w:p>
             <w:pPr>
-              <w:spacing w:after="0" w:before="0" w:line="276"/>
+              <w:spacing w:after="10" w:before="0" w:line="276"/>
             </w:pPr>
             <w:r>
               <w:rPr>
@@ -7004,13 +7692,38 @@
                 <w:sz w:val="15"/>
                 <w:szCs w:val="15"/>
               </w:rPr>
-              <w:t xml:space="preserve">The requirement</w:t>
-            </w:r>
-          </w:p>
-        </w:tc>
-        <w:tc>
-          <w:tcPr>
-            <w:tcW w:type="dxa" w:w="7360"/>
+              <w:t xml:space="preserve">Problem Identifier</w:t>
+            </w:r>
+            <w:r>
+              <w:rPr>
+                <w:rFonts w:ascii="Calibri" w:cs="Calibri" w:eastAsia="Calibri" w:hAnsi="Calibri"/>
+                <w:b/>
+                <w:bCs/>
+                <w:color w:val="7E8CA1"/>
+                <w:sz w:val="13"/>
+                <w:szCs w:val="13"/>
+              </w:rPr>
+              <w:t xml:space="preserve">  / 5</w:t>
+            </w:r>
+          </w:p>
+          <w:p>
+            <w:pPr>
+              <w:spacing w:after="0" w:before="0" w:line="276"/>
+            </w:pPr>
+            <w:r>
+              <w:rPr>
+                <w:rFonts w:ascii="Calibri" w:cs="Calibri" w:eastAsia="Calibri" w:hAnsi="Calibri"/>
+                <w:color w:val="7E8CA1"/>
+                <w:sz w:val="14"/>
+                <w:szCs w:val="14"/>
+              </w:rPr>
+              <w:t xml:space="preserve">The requirement behind the concern</w:t>
+            </w:r>
+          </w:p>
+        </w:tc>
+        <w:tc>
+          <w:tcPr>
+            <w:tcW w:type="dxa" w:w="6760"/>
             <w:tcBorders>
               <w:top w:val="none" w:color="FFFFFF" w:sz="0"/>
               <w:left w:val="none" w:color="FFFFFF" w:sz="0"/>
@@ -7042,11 +7755,11 @@
       </w:tr>
       <w:tr>
         <w:trPr>
-          <w:trHeight w:val="369" w:hRule="atLeast"/>
+          <w:trHeight w:val="397" w:hRule="atLeast"/>
         </w:trPr>
         <w:tc>
           <w:tcPr>
-            <w:tcW w:type="dxa" w:w="2000"/>
+            <w:tcW w:type="dxa" w:w="2600"/>
             <w:tcBorders>
               <w:top w:val="none" w:color="FFFFFF" w:sz="0"/>
               <w:left w:val="none" w:color="FFFFFF" w:sz="0"/>
@@ -7057,13 +7770,13 @@
               <w:top w:type="dxa" w:w="90"/>
               <w:left w:type="dxa" w:w="150"/>
               <w:bottom w:type="dxa" w:w="90"/>
-              <w:right w:type="dxa" w:w="100"/>
+              <w:right w:type="dxa" w:w="110"/>
             </w:tcMar>
             <w:vAlign w:val="top"/>
           </w:tcPr>
           <w:p>
             <w:pPr>
-              <w:spacing w:after="0" w:before="0" w:line="276"/>
+              <w:spacing w:after="10" w:before="0" w:line="276"/>
             </w:pPr>
             <w:r>
               <w:rPr>
@@ -7075,13 +7788,38 @@
                 <w:sz w:val="15"/>
                 <w:szCs w:val="15"/>
               </w:rPr>
+              <w:t xml:space="preserve">Solution Designer</w:t>
+            </w:r>
+            <w:r>
+              <w:rPr>
+                <w:rFonts w:ascii="Calibri" w:cs="Calibri" w:eastAsia="Calibri" w:hAnsi="Calibri"/>
+                <w:b/>
+                <w:bCs/>
+                <w:color w:val="7E8CA1"/>
+                <w:sz w:val="13"/>
+                <w:szCs w:val="13"/>
+              </w:rPr>
+              <w:t xml:space="preserve">  / 10</w:t>
+            </w:r>
+          </w:p>
+          <w:p>
+            <w:pPr>
+              <w:spacing w:after="0" w:before="0" w:line="276"/>
+            </w:pPr>
+            <w:r>
+              <w:rPr>
+                <w:rFonts w:ascii="Calibri" w:cs="Calibri" w:eastAsia="Calibri" w:hAnsi="Calibri"/>
+                <w:color w:val="7E8CA1"/>
+                <w:sz w:val="14"/>
+                <w:szCs w:val="14"/>
+              </w:rPr>
               <w:t xml:space="preserve">Product / platform</w:t>
             </w:r>
           </w:p>
         </w:tc>
         <w:tc>
           <w:tcPr>
-            <w:tcW w:type="dxa" w:w="7360"/>
+            <w:tcW w:type="dxa" w:w="6760"/>
             <w:tcBorders>
               <w:top w:val="none" w:color="FFFFFF" w:sz="0"/>
               <w:left w:val="none" w:color="FFFFFF" w:sz="0"/>
@@ -7117,7 +7855,7 @@
         </w:trPr>
         <w:tc>
           <w:tcPr>
-            <w:tcW w:type="dxa" w:w="2000"/>
+            <w:tcW w:type="dxa" w:w="2600"/>
             <w:tcBorders>
               <w:top w:val="none" w:color="FFFFFF" w:sz="0"/>
               <w:left w:val="none" w:color="FFFFFF" w:sz="0"/>
@@ -7128,13 +7866,13 @@
               <w:top w:type="dxa" w:w="90"/>
               <w:left w:type="dxa" w:w="150"/>
               <w:bottom w:type="dxa" w:w="90"/>
-              <w:right w:type="dxa" w:w="100"/>
+              <w:right w:type="dxa" w:w="110"/>
             </w:tcMar>
             <w:vAlign w:val="top"/>
           </w:tcPr>
           <w:p>
             <w:pPr>
-              <w:spacing w:after="0" w:before="0" w:line="276"/>
+              <w:spacing w:after="10" w:before="0" w:line="276"/>
             </w:pPr>
             <w:r>
               <w:rPr>
@@ -7146,13 +7884,38 @@
                 <w:sz w:val="15"/>
                 <w:szCs w:val="15"/>
               </w:rPr>
+              <w:t xml:space="preserve">Value Communicator</w:t>
+            </w:r>
+            <w:r>
+              <w:rPr>
+                <w:rFonts w:ascii="Calibri" w:cs="Calibri" w:eastAsia="Calibri" w:hAnsi="Calibri"/>
+                <w:b/>
+                <w:bCs/>
+                <w:color w:val="7E8CA1"/>
+                <w:sz w:val="13"/>
+                <w:szCs w:val="13"/>
+              </w:rPr>
+              <w:t xml:space="preserve">  / 10</w:t>
+            </w:r>
+          </w:p>
+          <w:p>
+            <w:pPr>
+              <w:spacing w:after="0" w:before="0" w:line="276"/>
+            </w:pPr>
+            <w:r>
+              <w:rPr>
+                <w:rFonts w:ascii="Calibri" w:cs="Calibri" w:eastAsia="Calibri" w:hAnsi="Calibri"/>
+                <w:color w:val="7E8CA1"/>
+                <w:sz w:val="14"/>
+                <w:szCs w:val="14"/>
+              </w:rPr>
               <w:t xml:space="preserve">How it helps, and the outcome</w:t>
             </w:r>
           </w:p>
         </w:tc>
         <w:tc>
           <w:tcPr>
-            <w:tcW w:type="dxa" w:w="7360"/>
+            <w:tcW w:type="dxa" w:w="6760"/>
             <w:tcBorders>
               <w:top w:val="none" w:color="FFFFFF" w:sz="0"/>
               <w:left w:val="none" w:color="FFFFFF" w:sz="0"/>
@@ -7288,16 +8051,16 @@
         </w:tblBorders>
       </w:tblPr>
       <w:tblGrid>
-        <w:gridCol w:w="2000"/>
-        <w:gridCol w:w="7360"/>
+        <w:gridCol w:w="2600"/>
+        <w:gridCol w:w="6760"/>
       </w:tblGrid>
       <w:tr>
         <w:trPr>
-          <w:trHeight w:val="369" w:hRule="atLeast"/>
+          <w:trHeight w:val="397" w:hRule="atLeast"/>
         </w:trPr>
         <w:tc>
           <w:tcPr>
-            <w:tcW w:type="dxa" w:w="2000"/>
+            <w:tcW w:type="dxa" w:w="2600"/>
             <w:tcBorders>
               <w:top w:val="none" w:color="FFFFFF" w:sz="0"/>
               <w:left w:val="none" w:color="FFFFFF" w:sz="0"/>
@@ -7308,13 +8071,13 @@
               <w:top w:type="dxa" w:w="90"/>
               <w:left w:type="dxa" w:w="150"/>
               <w:bottom w:type="dxa" w:w="90"/>
-              <w:right w:type="dxa" w:w="100"/>
+              <w:right w:type="dxa" w:w="110"/>
             </w:tcMar>
             <w:vAlign w:val="top"/>
           </w:tcPr>
           <w:p>
             <w:pPr>
-              <w:spacing w:after="0" w:before="0" w:line="276"/>
+              <w:spacing w:after="10" w:before="0" w:line="276"/>
             </w:pPr>
             <w:r>
               <w:rPr>
@@ -7326,13 +8089,38 @@
                 <w:sz w:val="15"/>
                 <w:szCs w:val="15"/>
               </w:rPr>
-              <w:t xml:space="preserve">The requirement</w:t>
-            </w:r>
-          </w:p>
-        </w:tc>
-        <w:tc>
-          <w:tcPr>
-            <w:tcW w:type="dxa" w:w="7360"/>
+              <w:t xml:space="preserve">Problem Identifier</w:t>
+            </w:r>
+            <w:r>
+              <w:rPr>
+                <w:rFonts w:ascii="Calibri" w:cs="Calibri" w:eastAsia="Calibri" w:hAnsi="Calibri"/>
+                <w:b/>
+                <w:bCs/>
+                <w:color w:val="7E8CA1"/>
+                <w:sz w:val="13"/>
+                <w:szCs w:val="13"/>
+              </w:rPr>
+              <w:t xml:space="preserve">  / 5</w:t>
+            </w:r>
+          </w:p>
+          <w:p>
+            <w:pPr>
+              <w:spacing w:after="0" w:before="0" w:line="276"/>
+            </w:pPr>
+            <w:r>
+              <w:rPr>
+                <w:rFonts w:ascii="Calibri" w:cs="Calibri" w:eastAsia="Calibri" w:hAnsi="Calibri"/>
+                <w:color w:val="7E8CA1"/>
+                <w:sz w:val="14"/>
+                <w:szCs w:val="14"/>
+              </w:rPr>
+              <w:t xml:space="preserve">The requirement behind the concern</w:t>
+            </w:r>
+          </w:p>
+        </w:tc>
+        <w:tc>
+          <w:tcPr>
+            <w:tcW w:type="dxa" w:w="6760"/>
             <w:tcBorders>
               <w:top w:val="none" w:color="FFFFFF" w:sz="0"/>
               <w:left w:val="none" w:color="FFFFFF" w:sz="0"/>
@@ -7364,11 +8152,11 @@
       </w:tr>
       <w:tr>
         <w:trPr>
-          <w:trHeight w:val="369" w:hRule="atLeast"/>
+          <w:trHeight w:val="397" w:hRule="atLeast"/>
         </w:trPr>
         <w:tc>
           <w:tcPr>
-            <w:tcW w:type="dxa" w:w="2000"/>
+            <w:tcW w:type="dxa" w:w="2600"/>
             <w:tcBorders>
               <w:top w:val="none" w:color="FFFFFF" w:sz="0"/>
               <w:left w:val="none" w:color="FFFFFF" w:sz="0"/>
@@ -7379,13 +8167,13 @@
               <w:top w:type="dxa" w:w="90"/>
               <w:left w:type="dxa" w:w="150"/>
               <w:bottom w:type="dxa" w:w="90"/>
-              <w:right w:type="dxa" w:w="100"/>
+              <w:right w:type="dxa" w:w="110"/>
             </w:tcMar>
             <w:vAlign w:val="top"/>
           </w:tcPr>
           <w:p>
             <w:pPr>
-              <w:spacing w:after="0" w:before="0" w:line="276"/>
+              <w:spacing w:after="10" w:before="0" w:line="276"/>
             </w:pPr>
             <w:r>
               <w:rPr>
@@ -7397,13 +8185,38 @@
                 <w:sz w:val="15"/>
                 <w:szCs w:val="15"/>
               </w:rPr>
+              <w:t xml:space="preserve">Solution Designer</w:t>
+            </w:r>
+            <w:r>
+              <w:rPr>
+                <w:rFonts w:ascii="Calibri" w:cs="Calibri" w:eastAsia="Calibri" w:hAnsi="Calibri"/>
+                <w:b/>
+                <w:bCs/>
+                <w:color w:val="7E8CA1"/>
+                <w:sz w:val="13"/>
+                <w:szCs w:val="13"/>
+              </w:rPr>
+              <w:t xml:space="preserve">  / 10</w:t>
+            </w:r>
+          </w:p>
+          <w:p>
+            <w:pPr>
+              <w:spacing w:after="0" w:before="0" w:line="276"/>
+            </w:pPr>
+            <w:r>
+              <w:rPr>
+                <w:rFonts w:ascii="Calibri" w:cs="Calibri" w:eastAsia="Calibri" w:hAnsi="Calibri"/>
+                <w:color w:val="7E8CA1"/>
+                <w:sz w:val="14"/>
+                <w:szCs w:val="14"/>
+              </w:rPr>
               <w:t xml:space="preserve">Product / platform</w:t>
             </w:r>
           </w:p>
         </w:tc>
         <w:tc>
           <w:tcPr>
-            <w:tcW w:type="dxa" w:w="7360"/>
+            <w:tcW w:type="dxa" w:w="6760"/>
             <w:tcBorders>
               <w:top w:val="none" w:color="FFFFFF" w:sz="0"/>
               <w:left w:val="none" w:color="FFFFFF" w:sz="0"/>
@@ -7439,7 +8252,7 @@
         </w:trPr>
         <w:tc>
           <w:tcPr>
-            <w:tcW w:type="dxa" w:w="2000"/>
+            <w:tcW w:type="dxa" w:w="2600"/>
             <w:tcBorders>
               <w:top w:val="none" w:color="FFFFFF" w:sz="0"/>
               <w:left w:val="none" w:color="FFFFFF" w:sz="0"/>
@@ -7450,13 +8263,13 @@
               <w:top w:type="dxa" w:w="90"/>
               <w:left w:type="dxa" w:w="150"/>
               <w:bottom w:type="dxa" w:w="90"/>
-              <w:right w:type="dxa" w:w="100"/>
+              <w:right w:type="dxa" w:w="110"/>
             </w:tcMar>
             <w:vAlign w:val="top"/>
           </w:tcPr>
           <w:p>
             <w:pPr>
-              <w:spacing w:after="0" w:before="0" w:line="276"/>
+              <w:spacing w:after="10" w:before="0" w:line="276"/>
             </w:pPr>
             <w:r>
               <w:rPr>
@@ -7468,13 +8281,38 @@
                 <w:sz w:val="15"/>
                 <w:szCs w:val="15"/>
               </w:rPr>
+              <w:t xml:space="preserve">Value Communicator</w:t>
+            </w:r>
+            <w:r>
+              <w:rPr>
+                <w:rFonts w:ascii="Calibri" w:cs="Calibri" w:eastAsia="Calibri" w:hAnsi="Calibri"/>
+                <w:b/>
+                <w:bCs/>
+                <w:color w:val="7E8CA1"/>
+                <w:sz w:val="13"/>
+                <w:szCs w:val="13"/>
+              </w:rPr>
+              <w:t xml:space="preserve">  / 10</w:t>
+            </w:r>
+          </w:p>
+          <w:p>
+            <w:pPr>
+              <w:spacing w:after="0" w:before="0" w:line="276"/>
+            </w:pPr>
+            <w:r>
+              <w:rPr>
+                <w:rFonts w:ascii="Calibri" w:cs="Calibri" w:eastAsia="Calibri" w:hAnsi="Calibri"/>
+                <w:color w:val="7E8CA1"/>
+                <w:sz w:val="14"/>
+                <w:szCs w:val="14"/>
+              </w:rPr>
               <w:t xml:space="preserve">How it helps, and the outcome</w:t>
             </w:r>
           </w:p>
         </w:tc>
         <w:tc>
           <w:tcPr>
-            <w:tcW w:type="dxa" w:w="7360"/>
+            <w:tcW w:type="dxa" w:w="6760"/>
             <w:tcBorders>
               <w:top w:val="none" w:color="FFFFFF" w:sz="0"/>
               <w:left w:val="none" w:color="FFFFFF" w:sz="0"/>
@@ -7610,16 +8448,16 @@
         </w:tblBorders>
       </w:tblPr>
       <w:tblGrid>
-        <w:gridCol w:w="2000"/>
-        <w:gridCol w:w="7360"/>
+        <w:gridCol w:w="2600"/>
+        <w:gridCol w:w="6760"/>
       </w:tblGrid>
       <w:tr>
         <w:trPr>
-          <w:trHeight w:val="369" w:hRule="atLeast"/>
+          <w:trHeight w:val="397" w:hRule="atLeast"/>
         </w:trPr>
         <w:tc>
           <w:tcPr>
-            <w:tcW w:type="dxa" w:w="2000"/>
+            <w:tcW w:type="dxa" w:w="2600"/>
             <w:tcBorders>
               <w:top w:val="none" w:color="FFFFFF" w:sz="0"/>
               <w:left w:val="none" w:color="FFFFFF" w:sz="0"/>
@@ -7630,13 +8468,13 @@
               <w:top w:type="dxa" w:w="90"/>
               <w:left w:type="dxa" w:w="150"/>
               <w:bottom w:type="dxa" w:w="90"/>
-              <w:right w:type="dxa" w:w="100"/>
+              <w:right w:type="dxa" w:w="110"/>
             </w:tcMar>
             <w:vAlign w:val="top"/>
           </w:tcPr>
           <w:p>
             <w:pPr>
-              <w:spacing w:after="0" w:before="0" w:line="276"/>
+              <w:spacing w:after="10" w:before="0" w:line="276"/>
             </w:pPr>
             <w:r>
               <w:rPr>
@@ -7648,13 +8486,38 @@
                 <w:sz w:val="15"/>
                 <w:szCs w:val="15"/>
               </w:rPr>
-              <w:t xml:space="preserve">The requirement</w:t>
-            </w:r>
-          </w:p>
-        </w:tc>
-        <w:tc>
-          <w:tcPr>
-            <w:tcW w:type="dxa" w:w="7360"/>
+              <w:t xml:space="preserve">Problem Identifier</w:t>
+            </w:r>
+            <w:r>
+              <w:rPr>
+                <w:rFonts w:ascii="Calibri" w:cs="Calibri" w:eastAsia="Calibri" w:hAnsi="Calibri"/>
+                <w:b/>
+                <w:bCs/>
+                <w:color w:val="7E8CA1"/>
+                <w:sz w:val="13"/>
+                <w:szCs w:val="13"/>
+              </w:rPr>
+              <w:t xml:space="preserve">  / 5</w:t>
+            </w:r>
+          </w:p>
+          <w:p>
+            <w:pPr>
+              <w:spacing w:after="0" w:before="0" w:line="276"/>
+            </w:pPr>
+            <w:r>
+              <w:rPr>
+                <w:rFonts w:ascii="Calibri" w:cs="Calibri" w:eastAsia="Calibri" w:hAnsi="Calibri"/>
+                <w:color w:val="7E8CA1"/>
+                <w:sz w:val="14"/>
+                <w:szCs w:val="14"/>
+              </w:rPr>
+              <w:t xml:space="preserve">The requirement behind the concern</w:t>
+            </w:r>
+          </w:p>
+        </w:tc>
+        <w:tc>
+          <w:tcPr>
+            <w:tcW w:type="dxa" w:w="6760"/>
             <w:tcBorders>
               <w:top w:val="none" w:color="FFFFFF" w:sz="0"/>
               <w:left w:val="none" w:color="FFFFFF" w:sz="0"/>
@@ -7686,11 +8549,11 @@
       </w:tr>
       <w:tr>
         <w:trPr>
-          <w:trHeight w:val="369" w:hRule="atLeast"/>
+          <w:trHeight w:val="397" w:hRule="atLeast"/>
         </w:trPr>
         <w:tc>
           <w:tcPr>
-            <w:tcW w:type="dxa" w:w="2000"/>
+            <w:tcW w:type="dxa" w:w="2600"/>
             <w:tcBorders>
               <w:top w:val="none" w:color="FFFFFF" w:sz="0"/>
               <w:left w:val="none" w:color="FFFFFF" w:sz="0"/>
@@ -7701,13 +8564,13 @@
               <w:top w:type="dxa" w:w="90"/>
               <w:left w:type="dxa" w:w="150"/>
               <w:bottom w:type="dxa" w:w="90"/>
-              <w:right w:type="dxa" w:w="100"/>
+              <w:right w:type="dxa" w:w="110"/>
             </w:tcMar>
             <w:vAlign w:val="top"/>
           </w:tcPr>
           <w:p>
             <w:pPr>
-              <w:spacing w:after="0" w:before="0" w:line="276"/>
+              <w:spacing w:after="10" w:before="0" w:line="276"/>
             </w:pPr>
             <w:r>
               <w:rPr>
@@ -7719,13 +8582,38 @@
                 <w:sz w:val="15"/>
                 <w:szCs w:val="15"/>
               </w:rPr>
+              <w:t xml:space="preserve">Solution Designer</w:t>
+            </w:r>
+            <w:r>
+              <w:rPr>
+                <w:rFonts w:ascii="Calibri" w:cs="Calibri" w:eastAsia="Calibri" w:hAnsi="Calibri"/>
+                <w:b/>
+                <w:bCs/>
+                <w:color w:val="7E8CA1"/>
+                <w:sz w:val="13"/>
+                <w:szCs w:val="13"/>
+              </w:rPr>
+              <w:t xml:space="preserve">  / 10</w:t>
+            </w:r>
+          </w:p>
+          <w:p>
+            <w:pPr>
+              <w:spacing w:after="0" w:before="0" w:line="276"/>
+            </w:pPr>
+            <w:r>
+              <w:rPr>
+                <w:rFonts w:ascii="Calibri" w:cs="Calibri" w:eastAsia="Calibri" w:hAnsi="Calibri"/>
+                <w:color w:val="7E8CA1"/>
+                <w:sz w:val="14"/>
+                <w:szCs w:val="14"/>
+              </w:rPr>
               <w:t xml:space="preserve">Product / platform</w:t>
             </w:r>
           </w:p>
         </w:tc>
         <w:tc>
           <w:tcPr>
-            <w:tcW w:type="dxa" w:w="7360"/>
+            <w:tcW w:type="dxa" w:w="6760"/>
             <w:tcBorders>
               <w:top w:val="none" w:color="FFFFFF" w:sz="0"/>
               <w:left w:val="none" w:color="FFFFFF" w:sz="0"/>
@@ -7761,7 +8649,7 @@
         </w:trPr>
         <w:tc>
           <w:tcPr>
-            <w:tcW w:type="dxa" w:w="2000"/>
+            <w:tcW w:type="dxa" w:w="2600"/>
             <w:tcBorders>
               <w:top w:val="none" w:color="FFFFFF" w:sz="0"/>
               <w:left w:val="none" w:color="FFFFFF" w:sz="0"/>
@@ -7772,13 +8660,13 @@
               <w:top w:type="dxa" w:w="90"/>
               <w:left w:type="dxa" w:w="150"/>
               <w:bottom w:type="dxa" w:w="90"/>
-              <w:right w:type="dxa" w:w="100"/>
+              <w:right w:type="dxa" w:w="110"/>
             </w:tcMar>
             <w:vAlign w:val="top"/>
           </w:tcPr>
           <w:p>
             <w:pPr>
-              <w:spacing w:after="0" w:before="0" w:line="276"/>
+              <w:spacing w:after="10" w:before="0" w:line="276"/>
             </w:pPr>
             <w:r>
               <w:rPr>
@@ -7790,13 +8678,38 @@
                 <w:sz w:val="15"/>
                 <w:szCs w:val="15"/>
               </w:rPr>
+              <w:t xml:space="preserve">Value Communicator</w:t>
+            </w:r>
+            <w:r>
+              <w:rPr>
+                <w:rFonts w:ascii="Calibri" w:cs="Calibri" w:eastAsia="Calibri" w:hAnsi="Calibri"/>
+                <w:b/>
+                <w:bCs/>
+                <w:color w:val="7E8CA1"/>
+                <w:sz w:val="13"/>
+                <w:szCs w:val="13"/>
+              </w:rPr>
+              <w:t xml:space="preserve">  / 10</w:t>
+            </w:r>
+          </w:p>
+          <w:p>
+            <w:pPr>
+              <w:spacing w:after="0" w:before="0" w:line="276"/>
+            </w:pPr>
+            <w:r>
+              <w:rPr>
+                <w:rFonts w:ascii="Calibri" w:cs="Calibri" w:eastAsia="Calibri" w:hAnsi="Calibri"/>
+                <w:color w:val="7E8CA1"/>
+                <w:sz w:val="14"/>
+                <w:szCs w:val="14"/>
+              </w:rPr>
               <w:t xml:space="preserve">How it helps, and the outcome</w:t>
             </w:r>
           </w:p>
         </w:tc>
         <w:tc>
           <w:tcPr>
-            <w:tcW w:type="dxa" w:w="7360"/>
+            <w:tcW w:type="dxa" w:w="6760"/>
             <w:tcBorders>
               <w:top w:val="none" w:color="FFFFFF" w:sz="0"/>
               <w:left w:val="none" w:color="FFFFFF" w:sz="0"/>
@@ -7932,16 +8845,16 @@
         </w:tblBorders>
       </w:tblPr>
       <w:tblGrid>
-        <w:gridCol w:w="2000"/>
-        <w:gridCol w:w="7360"/>
+        <w:gridCol w:w="2600"/>
+        <w:gridCol w:w="6760"/>
       </w:tblGrid>
       <w:tr>
         <w:trPr>
-          <w:trHeight w:val="369" w:hRule="atLeast"/>
+          <w:trHeight w:val="397" w:hRule="atLeast"/>
         </w:trPr>
         <w:tc>
           <w:tcPr>
-            <w:tcW w:type="dxa" w:w="2000"/>
+            <w:tcW w:type="dxa" w:w="2600"/>
             <w:tcBorders>
               <w:top w:val="none" w:color="FFFFFF" w:sz="0"/>
               <w:left w:val="none" w:color="FFFFFF" w:sz="0"/>
@@ -7952,13 +8865,13 @@
               <w:top w:type="dxa" w:w="90"/>
               <w:left w:type="dxa" w:w="150"/>
               <w:bottom w:type="dxa" w:w="90"/>
-              <w:right w:type="dxa" w:w="100"/>
+              <w:right w:type="dxa" w:w="110"/>
             </w:tcMar>
             <w:vAlign w:val="top"/>
           </w:tcPr>
           <w:p>
             <w:pPr>
-              <w:spacing w:after="0" w:before="0" w:line="276"/>
+              <w:spacing w:after="10" w:before="0" w:line="276"/>
             </w:pPr>
             <w:r>
               <w:rPr>
@@ -7970,13 +8883,38 @@
                 <w:sz w:val="15"/>
                 <w:szCs w:val="15"/>
               </w:rPr>
-              <w:t xml:space="preserve">The requirement</w:t>
-            </w:r>
-          </w:p>
-        </w:tc>
-        <w:tc>
-          <w:tcPr>
-            <w:tcW w:type="dxa" w:w="7360"/>
+              <w:t xml:space="preserve">Problem Identifier</w:t>
+            </w:r>
+            <w:r>
+              <w:rPr>
+                <w:rFonts w:ascii="Calibri" w:cs="Calibri" w:eastAsia="Calibri" w:hAnsi="Calibri"/>
+                <w:b/>
+                <w:bCs/>
+                <w:color w:val="7E8CA1"/>
+                <w:sz w:val="13"/>
+                <w:szCs w:val="13"/>
+              </w:rPr>
+              <w:t xml:space="preserve">  / 5</w:t>
+            </w:r>
+          </w:p>
+          <w:p>
+            <w:pPr>
+              <w:spacing w:after="0" w:before="0" w:line="276"/>
+            </w:pPr>
+            <w:r>
+              <w:rPr>
+                <w:rFonts w:ascii="Calibri" w:cs="Calibri" w:eastAsia="Calibri" w:hAnsi="Calibri"/>
+                <w:color w:val="7E8CA1"/>
+                <w:sz w:val="14"/>
+                <w:szCs w:val="14"/>
+              </w:rPr>
+              <w:t xml:space="preserve">The requirement behind the concern</w:t>
+            </w:r>
+          </w:p>
+        </w:tc>
+        <w:tc>
+          <w:tcPr>
+            <w:tcW w:type="dxa" w:w="6760"/>
             <w:tcBorders>
               <w:top w:val="none" w:color="FFFFFF" w:sz="0"/>
               <w:left w:val="none" w:color="FFFFFF" w:sz="0"/>
@@ -8008,11 +8946,11 @@
       </w:tr>
       <w:tr>
         <w:trPr>
-          <w:trHeight w:val="369" w:hRule="atLeast"/>
+          <w:trHeight w:val="397" w:hRule="atLeast"/>
         </w:trPr>
         <w:tc>
           <w:tcPr>
-            <w:tcW w:type="dxa" w:w="2000"/>
+            <w:tcW w:type="dxa" w:w="2600"/>
             <w:tcBorders>
               <w:top w:val="none" w:color="FFFFFF" w:sz="0"/>
               <w:left w:val="none" w:color="FFFFFF" w:sz="0"/>
@@ -8023,13 +8961,13 @@
               <w:top w:type="dxa" w:w="90"/>
               <w:left w:type="dxa" w:w="150"/>
               <w:bottom w:type="dxa" w:w="90"/>
-              <w:right w:type="dxa" w:w="100"/>
+              <w:right w:type="dxa" w:w="110"/>
             </w:tcMar>
             <w:vAlign w:val="top"/>
           </w:tcPr>
           <w:p>
             <w:pPr>
-              <w:spacing w:after="0" w:before="0" w:line="276"/>
+              <w:spacing w:after="10" w:before="0" w:line="276"/>
             </w:pPr>
             <w:r>
               <w:rPr>
@@ -8041,13 +8979,38 @@
                 <w:sz w:val="15"/>
                 <w:szCs w:val="15"/>
               </w:rPr>
+              <w:t xml:space="preserve">Solution Designer</w:t>
+            </w:r>
+            <w:r>
+              <w:rPr>
+                <w:rFonts w:ascii="Calibri" w:cs="Calibri" w:eastAsia="Calibri" w:hAnsi="Calibri"/>
+                <w:b/>
+                <w:bCs/>
+                <w:color w:val="7E8CA1"/>
+                <w:sz w:val="13"/>
+                <w:szCs w:val="13"/>
+              </w:rPr>
+              <w:t xml:space="preserve">  / 10</w:t>
+            </w:r>
+          </w:p>
+          <w:p>
+            <w:pPr>
+              <w:spacing w:after="0" w:before="0" w:line="276"/>
+            </w:pPr>
+            <w:r>
+              <w:rPr>
+                <w:rFonts w:ascii="Calibri" w:cs="Calibri" w:eastAsia="Calibri" w:hAnsi="Calibri"/>
+                <w:color w:val="7E8CA1"/>
+                <w:sz w:val="14"/>
+                <w:szCs w:val="14"/>
+              </w:rPr>
               <w:t xml:space="preserve">Product / platform</w:t>
             </w:r>
           </w:p>
         </w:tc>
         <w:tc>
           <w:tcPr>
-            <w:tcW w:type="dxa" w:w="7360"/>
+            <w:tcW w:type="dxa" w:w="6760"/>
             <w:tcBorders>
               <w:top w:val="none" w:color="FFFFFF" w:sz="0"/>
               <w:left w:val="none" w:color="FFFFFF" w:sz="0"/>
@@ -8083,7 +9046,7 @@
         </w:trPr>
         <w:tc>
           <w:tcPr>
-            <w:tcW w:type="dxa" w:w="2000"/>
+            <w:tcW w:type="dxa" w:w="2600"/>
             <w:tcBorders>
               <w:top w:val="none" w:color="FFFFFF" w:sz="0"/>
               <w:left w:val="none" w:color="FFFFFF" w:sz="0"/>
@@ -8094,13 +9057,13 @@
               <w:top w:type="dxa" w:w="90"/>
               <w:left w:type="dxa" w:w="150"/>
               <w:bottom w:type="dxa" w:w="90"/>
-              <w:right w:type="dxa" w:w="100"/>
+              <w:right w:type="dxa" w:w="110"/>
             </w:tcMar>
             <w:vAlign w:val="top"/>
           </w:tcPr>
           <w:p>
             <w:pPr>
-              <w:spacing w:after="0" w:before="0" w:line="276"/>
+              <w:spacing w:after="10" w:before="0" w:line="276"/>
             </w:pPr>
             <w:r>
               <w:rPr>
@@ -8112,13 +9075,38 @@
                 <w:sz w:val="15"/>
                 <w:szCs w:val="15"/>
               </w:rPr>
+              <w:t xml:space="preserve">Value Communicator</w:t>
+            </w:r>
+            <w:r>
+              <w:rPr>
+                <w:rFonts w:ascii="Calibri" w:cs="Calibri" w:eastAsia="Calibri" w:hAnsi="Calibri"/>
+                <w:b/>
+                <w:bCs/>
+                <w:color w:val="7E8CA1"/>
+                <w:sz w:val="13"/>
+                <w:szCs w:val="13"/>
+              </w:rPr>
+              <w:t xml:space="preserve">  / 10</w:t>
+            </w:r>
+          </w:p>
+          <w:p>
+            <w:pPr>
+              <w:spacing w:after="0" w:before="0" w:line="276"/>
+            </w:pPr>
+            <w:r>
+              <w:rPr>
+                <w:rFonts w:ascii="Calibri" w:cs="Calibri" w:eastAsia="Calibri" w:hAnsi="Calibri"/>
+                <w:color w:val="7E8CA1"/>
+                <w:sz w:val="14"/>
+                <w:szCs w:val="14"/>
+              </w:rPr>
               <w:t xml:space="preserve">How it helps, and the outcome</w:t>
             </w:r>
           </w:p>
         </w:tc>
         <w:tc>
           <w:tcPr>
-            <w:tcW w:type="dxa" w:w="7360"/>
+            <w:tcW w:type="dxa" w:w="6760"/>
             <w:tcBorders>
               <w:top w:val="none" w:color="FFFFFF" w:sz="0"/>
               <w:left w:val="none" w:color="FFFFFF" w:sz="0"/>
@@ -8515,16 +9503,16 @@
         </w:tblBorders>
       </w:tblPr>
       <w:tblGrid>
-        <w:gridCol w:w="2000"/>
-        <w:gridCol w:w="7360"/>
+        <w:gridCol w:w="2600"/>
+        <w:gridCol w:w="6760"/>
       </w:tblGrid>
       <w:tr>
         <w:trPr>
-          <w:trHeight w:val="369" w:hRule="atLeast"/>
+          <w:trHeight w:val="397" w:hRule="atLeast"/>
         </w:trPr>
         <w:tc>
           <w:tcPr>
-            <w:tcW w:type="dxa" w:w="2000"/>
+            <w:tcW w:type="dxa" w:w="2600"/>
             <w:tcBorders>
               <w:top w:val="none" w:color="FFFFFF" w:sz="0"/>
               <w:left w:val="none" w:color="FFFFFF" w:sz="0"/>
@@ -8535,13 +9523,13 @@
               <w:top w:type="dxa" w:w="90"/>
               <w:left w:type="dxa" w:w="150"/>
               <w:bottom w:type="dxa" w:w="90"/>
-              <w:right w:type="dxa" w:w="100"/>
+              <w:right w:type="dxa" w:w="110"/>
             </w:tcMar>
             <w:vAlign w:val="top"/>
           </w:tcPr>
           <w:p>
             <w:pPr>
-              <w:spacing w:after="0" w:before="0" w:line="276"/>
+              <w:spacing w:after="10" w:before="0" w:line="276"/>
             </w:pPr>
             <w:r>
               <w:rPr>
@@ -8553,13 +9541,38 @@
                 <w:sz w:val="15"/>
                 <w:szCs w:val="15"/>
               </w:rPr>
-              <w:t xml:space="preserve">The requirement</w:t>
-            </w:r>
-          </w:p>
-        </w:tc>
-        <w:tc>
-          <w:tcPr>
-            <w:tcW w:type="dxa" w:w="7360"/>
+              <w:t xml:space="preserve">Problem Identifier</w:t>
+            </w:r>
+            <w:r>
+              <w:rPr>
+                <w:rFonts w:ascii="Calibri" w:cs="Calibri" w:eastAsia="Calibri" w:hAnsi="Calibri"/>
+                <w:b/>
+                <w:bCs/>
+                <w:color w:val="7E8CA1"/>
+                <w:sz w:val="13"/>
+                <w:szCs w:val="13"/>
+              </w:rPr>
+              <w:t xml:space="preserve">  / 5</w:t>
+            </w:r>
+          </w:p>
+          <w:p>
+            <w:pPr>
+              <w:spacing w:after="0" w:before="0" w:line="276"/>
+            </w:pPr>
+            <w:r>
+              <w:rPr>
+                <w:rFonts w:ascii="Calibri" w:cs="Calibri" w:eastAsia="Calibri" w:hAnsi="Calibri"/>
+                <w:color w:val="7E8CA1"/>
+                <w:sz w:val="14"/>
+                <w:szCs w:val="14"/>
+              </w:rPr>
+              <w:t xml:space="preserve">The requirement behind the concern</w:t>
+            </w:r>
+          </w:p>
+        </w:tc>
+        <w:tc>
+          <w:tcPr>
+            <w:tcW w:type="dxa" w:w="6760"/>
             <w:tcBorders>
               <w:top w:val="none" w:color="FFFFFF" w:sz="0"/>
               <w:left w:val="none" w:color="FFFFFF" w:sz="0"/>
@@ -8591,11 +9604,11 @@
       </w:tr>
       <w:tr>
         <w:trPr>
-          <w:trHeight w:val="369" w:hRule="atLeast"/>
+          <w:trHeight w:val="397" w:hRule="atLeast"/>
         </w:trPr>
         <w:tc>
           <w:tcPr>
-            <w:tcW w:type="dxa" w:w="2000"/>
+            <w:tcW w:type="dxa" w:w="2600"/>
             <w:tcBorders>
               <w:top w:val="none" w:color="FFFFFF" w:sz="0"/>
               <w:left w:val="none" w:color="FFFFFF" w:sz="0"/>
@@ -8606,13 +9619,13 @@
               <w:top w:type="dxa" w:w="90"/>
               <w:left w:type="dxa" w:w="150"/>
               <w:bottom w:type="dxa" w:w="90"/>
-              <w:right w:type="dxa" w:w="100"/>
+              <w:right w:type="dxa" w:w="110"/>
             </w:tcMar>
             <w:vAlign w:val="top"/>
           </w:tcPr>
           <w:p>
             <w:pPr>
-              <w:spacing w:after="0" w:before="0" w:line="276"/>
+              <w:spacing w:after="10" w:before="0" w:line="276"/>
             </w:pPr>
             <w:r>
               <w:rPr>
@@ -8624,13 +9637,38 @@
                 <w:sz w:val="15"/>
                 <w:szCs w:val="15"/>
               </w:rPr>
+              <w:t xml:space="preserve">Solution Designer</w:t>
+            </w:r>
+            <w:r>
+              <w:rPr>
+                <w:rFonts w:ascii="Calibri" w:cs="Calibri" w:eastAsia="Calibri" w:hAnsi="Calibri"/>
+                <w:b/>
+                <w:bCs/>
+                <w:color w:val="7E8CA1"/>
+                <w:sz w:val="13"/>
+                <w:szCs w:val="13"/>
+              </w:rPr>
+              <w:t xml:space="preserve">  / 10</w:t>
+            </w:r>
+          </w:p>
+          <w:p>
+            <w:pPr>
+              <w:spacing w:after="0" w:before="0" w:line="276"/>
+            </w:pPr>
+            <w:r>
+              <w:rPr>
+                <w:rFonts w:ascii="Calibri" w:cs="Calibri" w:eastAsia="Calibri" w:hAnsi="Calibri"/>
+                <w:color w:val="7E8CA1"/>
+                <w:sz w:val="14"/>
+                <w:szCs w:val="14"/>
+              </w:rPr>
               <w:t xml:space="preserve">Product / platform</w:t>
             </w:r>
           </w:p>
         </w:tc>
         <w:tc>
           <w:tcPr>
-            <w:tcW w:type="dxa" w:w="7360"/>
+            <w:tcW w:type="dxa" w:w="6760"/>
             <w:tcBorders>
               <w:top w:val="none" w:color="FFFFFF" w:sz="0"/>
               <w:left w:val="none" w:color="FFFFFF" w:sz="0"/>
@@ -8666,7 +9704,7 @@
         </w:trPr>
         <w:tc>
           <w:tcPr>
-            <w:tcW w:type="dxa" w:w="2000"/>
+            <w:tcW w:type="dxa" w:w="2600"/>
             <w:tcBorders>
               <w:top w:val="none" w:color="FFFFFF" w:sz="0"/>
               <w:left w:val="none" w:color="FFFFFF" w:sz="0"/>
@@ -8677,13 +9715,13 @@
               <w:top w:type="dxa" w:w="90"/>
               <w:left w:type="dxa" w:w="150"/>
               <w:bottom w:type="dxa" w:w="90"/>
-              <w:right w:type="dxa" w:w="100"/>
+              <w:right w:type="dxa" w:w="110"/>
             </w:tcMar>
             <w:vAlign w:val="top"/>
           </w:tcPr>
           <w:p>
             <w:pPr>
-              <w:spacing w:after="0" w:before="0" w:line="276"/>
+              <w:spacing w:after="10" w:before="0" w:line="276"/>
             </w:pPr>
             <w:r>
               <w:rPr>
@@ -8695,13 +9733,38 @@
                 <w:sz w:val="15"/>
                 <w:szCs w:val="15"/>
               </w:rPr>
+              <w:t xml:space="preserve">Value Communicator</w:t>
+            </w:r>
+            <w:r>
+              <w:rPr>
+                <w:rFonts w:ascii="Calibri" w:cs="Calibri" w:eastAsia="Calibri" w:hAnsi="Calibri"/>
+                <w:b/>
+                <w:bCs/>
+                <w:color w:val="7E8CA1"/>
+                <w:sz w:val="13"/>
+                <w:szCs w:val="13"/>
+              </w:rPr>
+              <w:t xml:space="preserve">  / 10</w:t>
+            </w:r>
+          </w:p>
+          <w:p>
+            <w:pPr>
+              <w:spacing w:after="0" w:before="0" w:line="276"/>
+            </w:pPr>
+            <w:r>
+              <w:rPr>
+                <w:rFonts w:ascii="Calibri" w:cs="Calibri" w:eastAsia="Calibri" w:hAnsi="Calibri"/>
+                <w:color w:val="7E8CA1"/>
+                <w:sz w:val="14"/>
+                <w:szCs w:val="14"/>
+              </w:rPr>
               <w:t xml:space="preserve">How it helps, and the outcome</w:t>
             </w:r>
           </w:p>
         </w:tc>
         <w:tc>
           <w:tcPr>
-            <w:tcW w:type="dxa" w:w="7360"/>
+            <w:tcW w:type="dxa" w:w="6760"/>
             <w:tcBorders>
               <w:top w:val="none" w:color="FFFFFF" w:sz="0"/>
               <w:left w:val="none" w:color="FFFFFF" w:sz="0"/>
@@ -8837,16 +9900,16 @@
         </w:tblBorders>
       </w:tblPr>
       <w:tblGrid>
-        <w:gridCol w:w="2000"/>
-        <w:gridCol w:w="7360"/>
+        <w:gridCol w:w="2600"/>
+        <w:gridCol w:w="6760"/>
       </w:tblGrid>
       <w:tr>
         <w:trPr>
-          <w:trHeight w:val="369" w:hRule="atLeast"/>
+          <w:trHeight w:val="397" w:hRule="atLeast"/>
         </w:trPr>
         <w:tc>
           <w:tcPr>
-            <w:tcW w:type="dxa" w:w="2000"/>
+            <w:tcW w:type="dxa" w:w="2600"/>
             <w:tcBorders>
               <w:top w:val="none" w:color="FFFFFF" w:sz="0"/>
               <w:left w:val="none" w:color="FFFFFF" w:sz="0"/>
@@ -8857,13 +9920,13 @@
               <w:top w:type="dxa" w:w="90"/>
               <w:left w:type="dxa" w:w="150"/>
               <w:bottom w:type="dxa" w:w="90"/>
-              <w:right w:type="dxa" w:w="100"/>
+              <w:right w:type="dxa" w:w="110"/>
             </w:tcMar>
             <w:vAlign w:val="top"/>
           </w:tcPr>
           <w:p>
             <w:pPr>
-              <w:spacing w:after="0" w:before="0" w:line="276"/>
+              <w:spacing w:after="10" w:before="0" w:line="276"/>
             </w:pPr>
             <w:r>
               <w:rPr>
@@ -8875,13 +9938,38 @@
                 <w:sz w:val="15"/>
                 <w:szCs w:val="15"/>
               </w:rPr>
-              <w:t xml:space="preserve">The requirement</w:t>
-            </w:r>
-          </w:p>
-        </w:tc>
-        <w:tc>
-          <w:tcPr>
-            <w:tcW w:type="dxa" w:w="7360"/>
+              <w:t xml:space="preserve">Problem Identifier</w:t>
+            </w:r>
+            <w:r>
+              <w:rPr>
+                <w:rFonts w:ascii="Calibri" w:cs="Calibri" w:eastAsia="Calibri" w:hAnsi="Calibri"/>
+                <w:b/>
+                <w:bCs/>
+                <w:color w:val="7E8CA1"/>
+                <w:sz w:val="13"/>
+                <w:szCs w:val="13"/>
+              </w:rPr>
+              <w:t xml:space="preserve">  / 5</w:t>
+            </w:r>
+          </w:p>
+          <w:p>
+            <w:pPr>
+              <w:spacing w:after="0" w:before="0" w:line="276"/>
+            </w:pPr>
+            <w:r>
+              <w:rPr>
+                <w:rFonts w:ascii="Calibri" w:cs="Calibri" w:eastAsia="Calibri" w:hAnsi="Calibri"/>
+                <w:color w:val="7E8CA1"/>
+                <w:sz w:val="14"/>
+                <w:szCs w:val="14"/>
+              </w:rPr>
+              <w:t xml:space="preserve">The requirement behind the concern</w:t>
+            </w:r>
+          </w:p>
+        </w:tc>
+        <w:tc>
+          <w:tcPr>
+            <w:tcW w:type="dxa" w:w="6760"/>
             <w:tcBorders>
               <w:top w:val="none" w:color="FFFFFF" w:sz="0"/>
               <w:left w:val="none" w:color="FFFFFF" w:sz="0"/>
@@ -8913,11 +10001,11 @@
       </w:tr>
       <w:tr>
         <w:trPr>
-          <w:trHeight w:val="369" w:hRule="atLeast"/>
+          <w:trHeight w:val="397" w:hRule="atLeast"/>
         </w:trPr>
         <w:tc>
           <w:tcPr>
-            <w:tcW w:type="dxa" w:w="2000"/>
+            <w:tcW w:type="dxa" w:w="2600"/>
             <w:tcBorders>
               <w:top w:val="none" w:color="FFFFFF" w:sz="0"/>
               <w:left w:val="none" w:color="FFFFFF" w:sz="0"/>
@@ -8928,13 +10016,13 @@
               <w:top w:type="dxa" w:w="90"/>
               <w:left w:type="dxa" w:w="150"/>
               <w:bottom w:type="dxa" w:w="90"/>
-              <w:right w:type="dxa" w:w="100"/>
+              <w:right w:type="dxa" w:w="110"/>
             </w:tcMar>
             <w:vAlign w:val="top"/>
           </w:tcPr>
           <w:p>
             <w:pPr>
-              <w:spacing w:after="0" w:before="0" w:line="276"/>
+              <w:spacing w:after="10" w:before="0" w:line="276"/>
             </w:pPr>
             <w:r>
               <w:rPr>
@@ -8946,13 +10034,38 @@
                 <w:sz w:val="15"/>
                 <w:szCs w:val="15"/>
               </w:rPr>
+              <w:t xml:space="preserve">Solution Designer</w:t>
+            </w:r>
+            <w:r>
+              <w:rPr>
+                <w:rFonts w:ascii="Calibri" w:cs="Calibri" w:eastAsia="Calibri" w:hAnsi="Calibri"/>
+                <w:b/>
+                <w:bCs/>
+                <w:color w:val="7E8CA1"/>
+                <w:sz w:val="13"/>
+                <w:szCs w:val="13"/>
+              </w:rPr>
+              <w:t xml:space="preserve">  / 10</w:t>
+            </w:r>
+          </w:p>
+          <w:p>
+            <w:pPr>
+              <w:spacing w:after="0" w:before="0" w:line="276"/>
+            </w:pPr>
+            <w:r>
+              <w:rPr>
+                <w:rFonts w:ascii="Calibri" w:cs="Calibri" w:eastAsia="Calibri" w:hAnsi="Calibri"/>
+                <w:color w:val="7E8CA1"/>
+                <w:sz w:val="14"/>
+                <w:szCs w:val="14"/>
+              </w:rPr>
               <w:t xml:space="preserve">Product / platform</w:t>
             </w:r>
           </w:p>
         </w:tc>
         <w:tc>
           <w:tcPr>
-            <w:tcW w:type="dxa" w:w="7360"/>
+            <w:tcW w:type="dxa" w:w="6760"/>
             <w:tcBorders>
               <w:top w:val="none" w:color="FFFFFF" w:sz="0"/>
               <w:left w:val="none" w:color="FFFFFF" w:sz="0"/>
@@ -8988,7 +10101,7 @@
         </w:trPr>
         <w:tc>
           <w:tcPr>
-            <w:tcW w:type="dxa" w:w="2000"/>
+            <w:tcW w:type="dxa" w:w="2600"/>
             <w:tcBorders>
               <w:top w:val="none" w:color="FFFFFF" w:sz="0"/>
               <w:left w:val="none" w:color="FFFFFF" w:sz="0"/>
@@ -8999,13 +10112,13 @@
               <w:top w:type="dxa" w:w="90"/>
               <w:left w:type="dxa" w:w="150"/>
               <w:bottom w:type="dxa" w:w="90"/>
-              <w:right w:type="dxa" w:w="100"/>
+              <w:right w:type="dxa" w:w="110"/>
             </w:tcMar>
             <w:vAlign w:val="top"/>
           </w:tcPr>
           <w:p>
             <w:pPr>
-              <w:spacing w:after="0" w:before="0" w:line="276"/>
+              <w:spacing w:after="10" w:before="0" w:line="276"/>
             </w:pPr>
             <w:r>
               <w:rPr>
@@ -9017,13 +10130,38 @@
                 <w:sz w:val="15"/>
                 <w:szCs w:val="15"/>
               </w:rPr>
+              <w:t xml:space="preserve">Value Communicator</w:t>
+            </w:r>
+            <w:r>
+              <w:rPr>
+                <w:rFonts w:ascii="Calibri" w:cs="Calibri" w:eastAsia="Calibri" w:hAnsi="Calibri"/>
+                <w:b/>
+                <w:bCs/>
+                <w:color w:val="7E8CA1"/>
+                <w:sz w:val="13"/>
+                <w:szCs w:val="13"/>
+              </w:rPr>
+              <w:t xml:space="preserve">  / 10</w:t>
+            </w:r>
+          </w:p>
+          <w:p>
+            <w:pPr>
+              <w:spacing w:after="0" w:before="0" w:line="276"/>
+            </w:pPr>
+            <w:r>
+              <w:rPr>
+                <w:rFonts w:ascii="Calibri" w:cs="Calibri" w:eastAsia="Calibri" w:hAnsi="Calibri"/>
+                <w:color w:val="7E8CA1"/>
+                <w:sz w:val="14"/>
+                <w:szCs w:val="14"/>
+              </w:rPr>
               <w:t xml:space="preserve">How it helps, and the outcome</w:t>
             </w:r>
           </w:p>
         </w:tc>
         <w:tc>
           <w:tcPr>
-            <w:tcW w:type="dxa" w:w="7360"/>
+            <w:tcW w:type="dxa" w:w="6760"/>
             <w:tcBorders>
               <w:top w:val="none" w:color="FFFFFF" w:sz="0"/>
               <w:left w:val="none" w:color="FFFFFF" w:sz="0"/>
@@ -9159,16 +10297,16 @@
         </w:tblBorders>
       </w:tblPr>
       <w:tblGrid>
-        <w:gridCol w:w="2000"/>
-        <w:gridCol w:w="7360"/>
+        <w:gridCol w:w="2600"/>
+        <w:gridCol w:w="6760"/>
       </w:tblGrid>
       <w:tr>
         <w:trPr>
-          <w:trHeight w:val="369" w:hRule="atLeast"/>
+          <w:trHeight w:val="397" w:hRule="atLeast"/>
         </w:trPr>
         <w:tc>
           <w:tcPr>
-            <w:tcW w:type="dxa" w:w="2000"/>
+            <w:tcW w:type="dxa" w:w="2600"/>
             <w:tcBorders>
               <w:top w:val="none" w:color="FFFFFF" w:sz="0"/>
               <w:left w:val="none" w:color="FFFFFF" w:sz="0"/>
@@ -9179,13 +10317,13 @@
               <w:top w:type="dxa" w:w="90"/>
               <w:left w:type="dxa" w:w="150"/>
               <w:bottom w:type="dxa" w:w="90"/>
-              <w:right w:type="dxa" w:w="100"/>
+              <w:right w:type="dxa" w:w="110"/>
             </w:tcMar>
             <w:vAlign w:val="top"/>
           </w:tcPr>
           <w:p>
             <w:pPr>
-              <w:spacing w:after="0" w:before="0" w:line="276"/>
+              <w:spacing w:after="10" w:before="0" w:line="276"/>
             </w:pPr>
             <w:r>
               <w:rPr>
@@ -9197,13 +10335,38 @@
                 <w:sz w:val="15"/>
                 <w:szCs w:val="15"/>
               </w:rPr>
-              <w:t xml:space="preserve">The requirement</w:t>
-            </w:r>
-          </w:p>
-        </w:tc>
-        <w:tc>
-          <w:tcPr>
-            <w:tcW w:type="dxa" w:w="7360"/>
+              <w:t xml:space="preserve">Problem Identifier</w:t>
+            </w:r>
+            <w:r>
+              <w:rPr>
+                <w:rFonts w:ascii="Calibri" w:cs="Calibri" w:eastAsia="Calibri" w:hAnsi="Calibri"/>
+                <w:b/>
+                <w:bCs/>
+                <w:color w:val="7E8CA1"/>
+                <w:sz w:val="13"/>
+                <w:szCs w:val="13"/>
+              </w:rPr>
+              <w:t xml:space="preserve">  / 5</w:t>
+            </w:r>
+          </w:p>
+          <w:p>
+            <w:pPr>
+              <w:spacing w:after="0" w:before="0" w:line="276"/>
+            </w:pPr>
+            <w:r>
+              <w:rPr>
+                <w:rFonts w:ascii="Calibri" w:cs="Calibri" w:eastAsia="Calibri" w:hAnsi="Calibri"/>
+                <w:color w:val="7E8CA1"/>
+                <w:sz w:val="14"/>
+                <w:szCs w:val="14"/>
+              </w:rPr>
+              <w:t xml:space="preserve">The requirement behind the concern</w:t>
+            </w:r>
+          </w:p>
+        </w:tc>
+        <w:tc>
+          <w:tcPr>
+            <w:tcW w:type="dxa" w:w="6760"/>
             <w:tcBorders>
               <w:top w:val="none" w:color="FFFFFF" w:sz="0"/>
               <w:left w:val="none" w:color="FFFFFF" w:sz="0"/>
@@ -9235,11 +10398,11 @@
       </w:tr>
       <w:tr>
         <w:trPr>
-          <w:trHeight w:val="369" w:hRule="atLeast"/>
+          <w:trHeight w:val="397" w:hRule="atLeast"/>
         </w:trPr>
         <w:tc>
           <w:tcPr>
-            <w:tcW w:type="dxa" w:w="2000"/>
+            <w:tcW w:type="dxa" w:w="2600"/>
             <w:tcBorders>
               <w:top w:val="none" w:color="FFFFFF" w:sz="0"/>
               <w:left w:val="none" w:color="FFFFFF" w:sz="0"/>
@@ -9250,13 +10413,13 @@
               <w:top w:type="dxa" w:w="90"/>
               <w:left w:type="dxa" w:w="150"/>
               <w:bottom w:type="dxa" w:w="90"/>
-              <w:right w:type="dxa" w:w="100"/>
+              <w:right w:type="dxa" w:w="110"/>
             </w:tcMar>
             <w:vAlign w:val="top"/>
           </w:tcPr>
           <w:p>
             <w:pPr>
-              <w:spacing w:after="0" w:before="0" w:line="276"/>
+              <w:spacing w:after="10" w:before="0" w:line="276"/>
             </w:pPr>
             <w:r>
               <w:rPr>
@@ -9268,13 +10431,38 @@
                 <w:sz w:val="15"/>
                 <w:szCs w:val="15"/>
               </w:rPr>
+              <w:t xml:space="preserve">Solution Designer</w:t>
+            </w:r>
+            <w:r>
+              <w:rPr>
+                <w:rFonts w:ascii="Calibri" w:cs="Calibri" w:eastAsia="Calibri" w:hAnsi="Calibri"/>
+                <w:b/>
+                <w:bCs/>
+                <w:color w:val="7E8CA1"/>
+                <w:sz w:val="13"/>
+                <w:szCs w:val="13"/>
+              </w:rPr>
+              <w:t xml:space="preserve">  / 10</w:t>
+            </w:r>
+          </w:p>
+          <w:p>
+            <w:pPr>
+              <w:spacing w:after="0" w:before="0" w:line="276"/>
+            </w:pPr>
+            <w:r>
+              <w:rPr>
+                <w:rFonts w:ascii="Calibri" w:cs="Calibri" w:eastAsia="Calibri" w:hAnsi="Calibri"/>
+                <w:color w:val="7E8CA1"/>
+                <w:sz w:val="14"/>
+                <w:szCs w:val="14"/>
+              </w:rPr>
               <w:t xml:space="preserve">Product / platform</w:t>
             </w:r>
           </w:p>
         </w:tc>
         <w:tc>
           <w:tcPr>
-            <w:tcW w:type="dxa" w:w="7360"/>
+            <w:tcW w:type="dxa" w:w="6760"/>
             <w:tcBorders>
               <w:top w:val="none" w:color="FFFFFF" w:sz="0"/>
               <w:left w:val="none" w:color="FFFFFF" w:sz="0"/>
@@ -9310,7 +10498,7 @@
         </w:trPr>
         <w:tc>
           <w:tcPr>
-            <w:tcW w:type="dxa" w:w="2000"/>
+            <w:tcW w:type="dxa" w:w="2600"/>
             <w:tcBorders>
               <w:top w:val="none" w:color="FFFFFF" w:sz="0"/>
               <w:left w:val="none" w:color="FFFFFF" w:sz="0"/>
@@ -9321,13 +10509,13 @@
               <w:top w:type="dxa" w:w="90"/>
               <w:left w:type="dxa" w:w="150"/>
               <w:bottom w:type="dxa" w:w="90"/>
-              <w:right w:type="dxa" w:w="100"/>
+              <w:right w:type="dxa" w:w="110"/>
             </w:tcMar>
             <w:vAlign w:val="top"/>
           </w:tcPr>
           <w:p>
             <w:pPr>
-              <w:spacing w:after="0" w:before="0" w:line="276"/>
+              <w:spacing w:after="10" w:before="0" w:line="276"/>
             </w:pPr>
             <w:r>
               <w:rPr>
@@ -9339,13 +10527,38 @@
                 <w:sz w:val="15"/>
                 <w:szCs w:val="15"/>
               </w:rPr>
+              <w:t xml:space="preserve">Value Communicator</w:t>
+            </w:r>
+            <w:r>
+              <w:rPr>
+                <w:rFonts w:ascii="Calibri" w:cs="Calibri" w:eastAsia="Calibri" w:hAnsi="Calibri"/>
+                <w:b/>
+                <w:bCs/>
+                <w:color w:val="7E8CA1"/>
+                <w:sz w:val="13"/>
+                <w:szCs w:val="13"/>
+              </w:rPr>
+              <w:t xml:space="preserve">  / 10</w:t>
+            </w:r>
+          </w:p>
+          <w:p>
+            <w:pPr>
+              <w:spacing w:after="0" w:before="0" w:line="276"/>
+            </w:pPr>
+            <w:r>
+              <w:rPr>
+                <w:rFonts w:ascii="Calibri" w:cs="Calibri" w:eastAsia="Calibri" w:hAnsi="Calibri"/>
+                <w:color w:val="7E8CA1"/>
+                <w:sz w:val="14"/>
+                <w:szCs w:val="14"/>
+              </w:rPr>
               <w:t xml:space="preserve">How it helps, and the outcome</w:t>
             </w:r>
           </w:p>
         </w:tc>
         <w:tc>
           <w:tcPr>
-            <w:tcW w:type="dxa" w:w="7360"/>
+            <w:tcW w:type="dxa" w:w="6760"/>
             <w:tcBorders>
               <w:top w:val="none" w:color="FFFFFF" w:sz="0"/>
               <w:left w:val="none" w:color="FFFFFF" w:sz="0"/>
@@ -9481,16 +10694,16 @@
         </w:tblBorders>
       </w:tblPr>
       <w:tblGrid>
-        <w:gridCol w:w="2000"/>
-        <w:gridCol w:w="7360"/>
+        <w:gridCol w:w="2600"/>
+        <w:gridCol w:w="6760"/>
       </w:tblGrid>
       <w:tr>
         <w:trPr>
-          <w:trHeight w:val="369" w:hRule="atLeast"/>
+          <w:trHeight w:val="397" w:hRule="atLeast"/>
         </w:trPr>
         <w:tc>
           <w:tcPr>
-            <w:tcW w:type="dxa" w:w="2000"/>
+            <w:tcW w:type="dxa" w:w="2600"/>
             <w:tcBorders>
               <w:top w:val="none" w:color="FFFFFF" w:sz="0"/>
               <w:left w:val="none" w:color="FFFFFF" w:sz="0"/>
@@ -9501,13 +10714,13 @@
               <w:top w:type="dxa" w:w="90"/>
               <w:left w:type="dxa" w:w="150"/>
               <w:bottom w:type="dxa" w:w="90"/>
-              <w:right w:type="dxa" w:w="100"/>
+              <w:right w:type="dxa" w:w="110"/>
             </w:tcMar>
             <w:vAlign w:val="top"/>
           </w:tcPr>
           <w:p>
             <w:pPr>
-              <w:spacing w:after="0" w:before="0" w:line="276"/>
+              <w:spacing w:after="10" w:before="0" w:line="276"/>
             </w:pPr>
             <w:r>
               <w:rPr>
@@ -9519,13 +10732,38 @@
                 <w:sz w:val="15"/>
                 <w:szCs w:val="15"/>
               </w:rPr>
-              <w:t xml:space="preserve">The requirement</w:t>
-            </w:r>
-          </w:p>
-        </w:tc>
-        <w:tc>
-          <w:tcPr>
-            <w:tcW w:type="dxa" w:w="7360"/>
+              <w:t xml:space="preserve">Problem Identifier</w:t>
+            </w:r>
+            <w:r>
+              <w:rPr>
+                <w:rFonts w:ascii="Calibri" w:cs="Calibri" w:eastAsia="Calibri" w:hAnsi="Calibri"/>
+                <w:b/>
+                <w:bCs/>
+                <w:color w:val="7E8CA1"/>
+                <w:sz w:val="13"/>
+                <w:szCs w:val="13"/>
+              </w:rPr>
+              <w:t xml:space="preserve">  / 5</w:t>
+            </w:r>
+          </w:p>
+          <w:p>
+            <w:pPr>
+              <w:spacing w:after="0" w:before="0" w:line="276"/>
+            </w:pPr>
+            <w:r>
+              <w:rPr>
+                <w:rFonts w:ascii="Calibri" w:cs="Calibri" w:eastAsia="Calibri" w:hAnsi="Calibri"/>
+                <w:color w:val="7E8CA1"/>
+                <w:sz w:val="14"/>
+                <w:szCs w:val="14"/>
+              </w:rPr>
+              <w:t xml:space="preserve">The requirement behind the concern</w:t>
+            </w:r>
+          </w:p>
+        </w:tc>
+        <w:tc>
+          <w:tcPr>
+            <w:tcW w:type="dxa" w:w="6760"/>
             <w:tcBorders>
               <w:top w:val="none" w:color="FFFFFF" w:sz="0"/>
               <w:left w:val="none" w:color="FFFFFF" w:sz="0"/>
@@ -9557,11 +10795,11 @@
       </w:tr>
       <w:tr>
         <w:trPr>
-          <w:trHeight w:val="369" w:hRule="atLeast"/>
+          <w:trHeight w:val="397" w:hRule="atLeast"/>
         </w:trPr>
         <w:tc>
           <w:tcPr>
-            <w:tcW w:type="dxa" w:w="2000"/>
+            <w:tcW w:type="dxa" w:w="2600"/>
             <w:tcBorders>
               <w:top w:val="none" w:color="FFFFFF" w:sz="0"/>
               <w:left w:val="none" w:color="FFFFFF" w:sz="0"/>
@@ -9572,13 +10810,13 @@
               <w:top w:type="dxa" w:w="90"/>
               <w:left w:type="dxa" w:w="150"/>
               <w:bottom w:type="dxa" w:w="90"/>
-              <w:right w:type="dxa" w:w="100"/>
+              <w:right w:type="dxa" w:w="110"/>
             </w:tcMar>
             <w:vAlign w:val="top"/>
           </w:tcPr>
           <w:p>
             <w:pPr>
-              <w:spacing w:after="0" w:before="0" w:line="276"/>
+              <w:spacing w:after="10" w:before="0" w:line="276"/>
             </w:pPr>
             <w:r>
               <w:rPr>
@@ -9590,13 +10828,38 @@
                 <w:sz w:val="15"/>
                 <w:szCs w:val="15"/>
               </w:rPr>
+              <w:t xml:space="preserve">Solution Designer</w:t>
+            </w:r>
+            <w:r>
+              <w:rPr>
+                <w:rFonts w:ascii="Calibri" w:cs="Calibri" w:eastAsia="Calibri" w:hAnsi="Calibri"/>
+                <w:b/>
+                <w:bCs/>
+                <w:color w:val="7E8CA1"/>
+                <w:sz w:val="13"/>
+                <w:szCs w:val="13"/>
+              </w:rPr>
+              <w:t xml:space="preserve">  / 10</w:t>
+            </w:r>
+          </w:p>
+          <w:p>
+            <w:pPr>
+              <w:spacing w:after="0" w:before="0" w:line="276"/>
+            </w:pPr>
+            <w:r>
+              <w:rPr>
+                <w:rFonts w:ascii="Calibri" w:cs="Calibri" w:eastAsia="Calibri" w:hAnsi="Calibri"/>
+                <w:color w:val="7E8CA1"/>
+                <w:sz w:val="14"/>
+                <w:szCs w:val="14"/>
+              </w:rPr>
               <w:t xml:space="preserve">Product / platform</w:t>
             </w:r>
           </w:p>
         </w:tc>
         <w:tc>
           <w:tcPr>
-            <w:tcW w:type="dxa" w:w="7360"/>
+            <w:tcW w:type="dxa" w:w="6760"/>
             <w:tcBorders>
               <w:top w:val="none" w:color="FFFFFF" w:sz="0"/>
               <w:left w:val="none" w:color="FFFFFF" w:sz="0"/>
@@ -9632,7 +10895,7 @@
         </w:trPr>
         <w:tc>
           <w:tcPr>
-            <w:tcW w:type="dxa" w:w="2000"/>
+            <w:tcW w:type="dxa" w:w="2600"/>
             <w:tcBorders>
               <w:top w:val="none" w:color="FFFFFF" w:sz="0"/>
               <w:left w:val="none" w:color="FFFFFF" w:sz="0"/>
@@ -9643,13 +10906,13 @@
               <w:top w:type="dxa" w:w="90"/>
               <w:left w:type="dxa" w:w="150"/>
               <w:bottom w:type="dxa" w:w="90"/>
-              <w:right w:type="dxa" w:w="100"/>
+              <w:right w:type="dxa" w:w="110"/>
             </w:tcMar>
             <w:vAlign w:val="top"/>
           </w:tcPr>
           <w:p>
             <w:pPr>
-              <w:spacing w:after="0" w:before="0" w:line="276"/>
+              <w:spacing w:after="10" w:before="0" w:line="276"/>
             </w:pPr>
             <w:r>
               <w:rPr>
@@ -9661,13 +10924,38 @@
                 <w:sz w:val="15"/>
                 <w:szCs w:val="15"/>
               </w:rPr>
+              <w:t xml:space="preserve">Value Communicator</w:t>
+            </w:r>
+            <w:r>
+              <w:rPr>
+                <w:rFonts w:ascii="Calibri" w:cs="Calibri" w:eastAsia="Calibri" w:hAnsi="Calibri"/>
+                <w:b/>
+                <w:bCs/>
+                <w:color w:val="7E8CA1"/>
+                <w:sz w:val="13"/>
+                <w:szCs w:val="13"/>
+              </w:rPr>
+              <w:t xml:space="preserve">  / 10</w:t>
+            </w:r>
+          </w:p>
+          <w:p>
+            <w:pPr>
+              <w:spacing w:after="0" w:before="0" w:line="276"/>
+            </w:pPr>
+            <w:r>
+              <w:rPr>
+                <w:rFonts w:ascii="Calibri" w:cs="Calibri" w:eastAsia="Calibri" w:hAnsi="Calibri"/>
+                <w:color w:val="7E8CA1"/>
+                <w:sz w:val="14"/>
+                <w:szCs w:val="14"/>
+              </w:rPr>
               <w:t xml:space="preserve">How it helps, and the outcome</w:t>
             </w:r>
           </w:p>
         </w:tc>
         <w:tc>
           <w:tcPr>
-            <w:tcW w:type="dxa" w:w="7360"/>
+            <w:tcW w:type="dxa" w:w="6760"/>
             <w:tcBorders>
               <w:top w:val="none" w:color="FFFFFF" w:sz="0"/>
               <w:left w:val="none" w:color="FFFFFF" w:sz="0"/>

</xml_diff>